<commit_message>
Add executed notebook, BITS ID in report, README clone path
</commit_message>
<xml_diff>
--- a/reports/MLOps_Assignment1_Report.docx
+++ b/reports/MLOps_Assignment1_Report.docx
@@ -67,7 +67,7 @@
           <w:sz w:val="24"/>
           <w:szCs w:val="24"/>
         </w:rPr>
-        <w:t xml:space="preserve">BITS ID: ____________________</w:t>
+        <w:t xml:space="preserve">BITS ID: 2025AE05662</w:t>
       </w:r>
     </w:p>
     <w:p>
@@ -82,7 +82,7 @@
         </w:rPr>
         <w:t xml:space="preserve">Code repository: </w:t>
       </w:r>
-      <w:hyperlink w:history="1" r:id="rIda7nev3xqiipahbahxvarx">
+      <w:hyperlink w:history="1" r:id="rIdmu_ln26tnci0rkpt5xlpf">
         <w:r>
           <w:rPr>
             <w:rStyle w:val="Hyperlink"/>
@@ -5519,7 +5519,7 @@
       <w:r>
         <w:t xml:space="preserve">Code repository: </w:t>
       </w:r>
-      <w:hyperlink w:history="1" r:id="rIdppn5d8pw-jtlseynjdq4i">
+      <w:hyperlink w:history="1" r:id="rIdjkx4tfeduqqzuowfwluz9">
         <w:r>
           <w:rPr>
             <w:rStyle w:val="Hyperlink"/>

</xml_diff>

<commit_message>
Report: production-readiness evidence, deliverables checklist, video link; add screenshots
</commit_message>
<xml_diff>
--- a/reports/MLOps_Assignment1_Report.docx
+++ b/reports/MLOps_Assignment1_Report.docx
@@ -4,7 +4,7 @@
   <w:body>
     <w:p>
       <w:pPr>
-        <w:spacing w:after="200" w:before="2400"/>
+        <w:spacing w:after="200" w:before="2200"/>
         <w:jc w:val="center"/>
       </w:pPr>
       <w:r>
@@ -18,7 +18,7 @@
     </w:p>
     <w:p>
       <w:pPr>
-        <w:spacing w:after="200"/>
+        <w:spacing w:after="80"/>
         <w:jc w:val="center"/>
       </w:pPr>
       <w:r>
@@ -82,7 +82,7 @@
         </w:rPr>
         <w:t xml:space="preserve">Code repository: </w:t>
       </w:r>
-      <w:hyperlink w:history="1" r:id="rIdzmgnuy8b-cl2trd7qtlmz">
+      <w:hyperlink w:history="1" r:id="rId-hnzm3-vtyf56tiandc-a">
         <w:r>
           <w:rPr>
             <w:rStyle w:val="Hyperlink"/>
@@ -95,6 +95,30 @@
     </w:p>
     <w:p>
       <w:pPr>
+        <w:spacing w:after="80"/>
+        <w:jc w:val="center"/>
+      </w:pPr>
+      <w:r>
+        <w:rPr>
+          <w:sz w:val="24"/>
+          <w:szCs w:val="24"/>
+        </w:rPr>
+        <w:t xml:space="preserve">Pipeline video: </w:t>
+      </w:r>
+      <w:hyperlink w:history="1" r:id="rIdf_ejqhif6ftbxkz_wgxpr">
+        <w:r>
+          <w:rPr>
+            <w:rStyle w:val="Hyperlink"/>
+            <w:sz w:val="24"/>
+            <w:szCs w:val="24"/>
+          </w:rPr>
+          <w:t xml:space="preserve">Google Drive recording</w:t>
+        </w:r>
+      </w:hyperlink>
+    </w:p>
+    <w:p>
+      <w:pPr>
+        <w:spacing w:after="80"/>
         <w:jc w:val="center"/>
       </w:pPr>
       <w:r>
@@ -318,7 +342,7 @@
       <w:r>
         <w:drawing>
           <wp:inline distT="0" distB="0" distL="0" distR="0">
-            <wp:extent cx="5715000" cy="1476375"/>
+            <wp:extent cx="5334000" cy="1381125"/>
             <wp:effectExtent t="0" r="0" b="0" l="0"/>
             <wp:docPr id="1" name="00_architecture.png" descr="Figure 1. System architecture" title="Figure 1. System architecture"/>
             <wp:cNvGraphicFramePr>
@@ -343,7 +367,7 @@
                   <pic:spPr bwMode="auto">
                     <a:xfrm>
                       <a:off x="0" y="0"/>
-                      <a:ext cx="5715000" cy="1476375"/>
+                      <a:ext cx="5334000" cy="1381125"/>
                     </a:xfrm>
                     <a:prstGeom prst="rect">
                       <a:avLst/>
@@ -405,8 +429,8 @@
       <w:r>
         <w:rPr>
           <w:rFonts w:ascii="Consolas" w:cs="Consolas" w:eastAsia="Consolas" w:hAnsi="Consolas"/>
-          <w:sz w:val="18"/>
-          <w:szCs w:val="18"/>
+          <w:sz w:val="17"/>
+          <w:szCs w:val="17"/>
         </w:rPr>
         <w:t xml:space="preserve">git clone https://github.com/HARSH4411/mlops05662.git &amp;&amp; cd mlops05662</w:t>
       </w:r>
@@ -420,8 +444,8 @@
       <w:r>
         <w:rPr>
           <w:rFonts w:ascii="Consolas" w:cs="Consolas" w:eastAsia="Consolas" w:hAnsi="Consolas"/>
-          <w:sz w:val="18"/>
-          <w:szCs w:val="18"/>
+          <w:sz w:val="17"/>
+          <w:szCs w:val="17"/>
         </w:rPr>
         <w:t xml:space="preserve">python -m venv .venv &amp;&amp; .venv\Scripts\activate      # Linux: source .venv/bin/activate</w:t>
       </w:r>
@@ -435,8 +459,8 @@
       <w:r>
         <w:rPr>
           <w:rFonts w:ascii="Consolas" w:cs="Consolas" w:eastAsia="Consolas" w:hAnsi="Consolas"/>
-          <w:sz w:val="18"/>
-          <w:szCs w:val="18"/>
+          <w:sz w:val="17"/>
+          <w:szCs w:val="17"/>
         </w:rPr>
         <w:t xml:space="preserve">pip install -r requirements.txt</w:t>
       </w:r>
@@ -450,8 +474,8 @@
       <w:r>
         <w:rPr>
           <w:rFonts w:ascii="Consolas" w:cs="Consolas" w:eastAsia="Consolas" w:hAnsi="Consolas"/>
-          <w:sz w:val="18"/>
-          <w:szCs w:val="18"/>
+          <w:sz w:val="17"/>
+          <w:szCs w:val="17"/>
         </w:rPr>
         <w:t xml:space="preserve">$env:PYTHONPATH="src;."                                # Linux: export PYTHONPATH=src:.</w:t>
       </w:r>
@@ -465,8 +489,8 @@
       <w:r>
         <w:rPr>
           <w:rFonts w:ascii="Consolas" w:cs="Consolas" w:eastAsia="Consolas" w:hAnsi="Consolas"/>
-          <w:sz w:val="18"/>
-          <w:szCs w:val="18"/>
+          <w:sz w:val="17"/>
+          <w:szCs w:val="17"/>
         </w:rPr>
         <w:t xml:space="preserve">python scripts/download_data.py      # data</w:t>
       </w:r>
@@ -480,8 +504,8 @@
       <w:r>
         <w:rPr>
           <w:rFonts w:ascii="Consolas" w:cs="Consolas" w:eastAsia="Consolas" w:hAnsi="Consolas"/>
-          <w:sz w:val="18"/>
-          <w:szCs w:val="18"/>
+          <w:sz w:val="17"/>
+          <w:szCs w:val="17"/>
         </w:rPr>
         <w:t xml:space="preserve">python scripts/eda.py                # EDA figures</w:t>
       </w:r>
@@ -495,8 +519,8 @@
       <w:r>
         <w:rPr>
           <w:rFonts w:ascii="Consolas" w:cs="Consolas" w:eastAsia="Consolas" w:hAnsi="Consolas"/>
-          <w:sz w:val="18"/>
-          <w:szCs w:val="18"/>
+          <w:sz w:val="17"/>
+          <w:szCs w:val="17"/>
         </w:rPr>
         <w:t xml:space="preserve">python -m heart.train                # training + MLflow</w:t>
       </w:r>
@@ -510,8 +534,8 @@
       <w:r>
         <w:rPr>
           <w:rFonts w:ascii="Consolas" w:cs="Consolas" w:eastAsia="Consolas" w:hAnsi="Consolas"/>
-          <w:sz w:val="18"/>
-          <w:szCs w:val="18"/>
+          <w:sz w:val="17"/>
+          <w:szCs w:val="17"/>
         </w:rPr>
         <w:t xml:space="preserve">pytest -v                            # tests</w:t>
       </w:r>
@@ -525,10 +549,10 @@
       <w:r>
         <w:rPr>
           <w:rFonts w:ascii="Consolas" w:cs="Consolas" w:eastAsia="Consolas" w:hAnsi="Consolas"/>
-          <w:sz w:val="18"/>
-          <w:szCs w:val="18"/>
+          <w:sz w:val="17"/>
+          <w:szCs w:val="17"/>
         </w:rPr>
-        <w:t xml:space="preserve">docker build -t heart-api:latest .   # container</w:t>
+        <w:t xml:space="preserve">docker compose up -d --build         # API + Prometheus + Grafana</w:t>
       </w:r>
     </w:p>
     <w:p>
@@ -540,10 +564,25 @@
       <w:r>
         <w:rPr>
           <w:rFonts w:ascii="Consolas" w:cs="Consolas" w:eastAsia="Consolas" w:hAnsi="Consolas"/>
-          <w:sz w:val="18"/>
-          <w:szCs w:val="18"/>
+          <w:sz w:val="17"/>
+          <w:szCs w:val="17"/>
         </w:rPr>
-        <w:t xml:space="preserve">kubectl apply -f k8s/                # deployment</w:t>
+        <w:t xml:space="preserve">kubectl apply -f k8s/                # Kubernetes deployment</w:t>
+      </w:r>
+    </w:p>
+    <w:p>
+      <w:pPr>
+        <w:shd w:fill="F3F4F6" w:val="clear"/>
+        <w:spacing w:after="0"/>
+        <w:ind w:left="200"/>
+      </w:pPr>
+      <w:r>
+        <w:rPr>
+          <w:rFonts w:ascii="Consolas" w:cs="Consolas" w:eastAsia="Consolas" w:hAnsi="Consolas"/>
+          <w:sz w:val="17"/>
+          <w:szCs w:val="17"/>
+        </w:rPr>
+        <w:t xml:space="preserve">bash scripts/run_all.sh              # (Linux VM) all stages in one command</w:t>
       </w:r>
     </w:p>
     <w:p>
@@ -688,7 +727,7 @@
                 <w:sz w:val="19"/>
                 <w:szCs w:val="19"/>
               </w:rPr>
-              <w:t xml:space="preserve">download_data.py, eda.py, load_test.py</w:t>
+              <w:t xml:space="preserve">download_data.py, eda.py, load_test.py, run_all.sh</w:t>
             </w:r>
           </w:p>
         </w:tc>
@@ -722,7 +761,7 @@
                 <w:sz w:val="19"/>
                 <w:szCs w:val="19"/>
               </w:rPr>
-              <w:t xml:space="preserve">src/heart/</w:t>
+              <w:t xml:space="preserve">notebooks/</w:t>
             </w:r>
           </w:p>
         </w:tc>
@@ -751,7 +790,7 @@
                 <w:sz w:val="19"/>
                 <w:szCs w:val="19"/>
               </w:rPr>
-              <w:t xml:space="preserve">config, data cleaning, feature pipeline, training, prediction</w:t>
+              <w:t xml:space="preserve">eda_training_inference.ipynb (executed EDA, model comparison, inference)</w:t>
             </w:r>
           </w:p>
         </w:tc>
@@ -784,7 +823,7 @@
                 <w:sz w:val="19"/>
                 <w:szCs w:val="19"/>
               </w:rPr>
-              <w:t xml:space="preserve">api/</w:t>
+              <w:t xml:space="preserve">src/heart/</w:t>
             </w:r>
           </w:p>
         </w:tc>
@@ -812,7 +851,7 @@
                 <w:sz w:val="19"/>
                 <w:szCs w:val="19"/>
               </w:rPr>
-              <w:t xml:space="preserve">FastAPI application and request/response schemas</w:t>
+              <w:t xml:space="preserve">config, data cleaning, feature pipeline, training, prediction</w:t>
             </w:r>
           </w:p>
         </w:tc>
@@ -846,7 +885,7 @@
                 <w:sz w:val="19"/>
                 <w:szCs w:val="19"/>
               </w:rPr>
-              <w:t xml:space="preserve">tests/</w:t>
+              <w:t xml:space="preserve">api/</w:t>
             </w:r>
           </w:p>
         </w:tc>
@@ -875,7 +914,7 @@
                 <w:sz w:val="19"/>
                 <w:szCs w:val="19"/>
               </w:rPr>
-              <w:t xml:space="preserve">24 pytest unit tests (data, features, models, API)</w:t>
+              <w:t xml:space="preserve">FastAPI application and request/response schemas</w:t>
             </w:r>
           </w:p>
         </w:tc>
@@ -908,7 +947,7 @@
                 <w:sz w:val="19"/>
                 <w:szCs w:val="19"/>
               </w:rPr>
-              <w:t xml:space="preserve">.github/workflows/ci.yml</w:t>
+              <w:t xml:space="preserve">tests/</w:t>
             </w:r>
           </w:p>
         </w:tc>
@@ -936,7 +975,7 @@
                 <w:sz w:val="19"/>
                 <w:szCs w:val="19"/>
               </w:rPr>
-              <w:t xml:space="preserve">CI/CD pipeline</w:t>
+              <w:t xml:space="preserve">24 pytest unit tests (data, features, models, API)</w:t>
             </w:r>
           </w:p>
         </w:tc>
@@ -970,7 +1009,7 @@
                 <w:sz w:val="19"/>
                 <w:szCs w:val="19"/>
               </w:rPr>
-              <w:t xml:space="preserve">Dockerfile, docker-compose.yml</w:t>
+              <w:t xml:space="preserve">.github/workflows/ci.yml</w:t>
             </w:r>
           </w:p>
         </w:tc>
@@ -999,7 +1038,7 @@
                 <w:sz w:val="19"/>
                 <w:szCs w:val="19"/>
               </w:rPr>
-              <w:t xml:space="preserve">Serving image; local stack with Prometheus + Grafana</w:t>
+              <w:t xml:space="preserve">CI/CD pipeline</w:t>
             </w:r>
           </w:p>
         </w:tc>
@@ -1032,7 +1071,7 @@
                 <w:sz w:val="19"/>
                 <w:szCs w:val="19"/>
               </w:rPr>
-              <w:t xml:space="preserve">k8s/</w:t>
+              <w:t xml:space="preserve">Dockerfile, docker-compose.yml</w:t>
             </w:r>
           </w:p>
         </w:tc>
@@ -1060,7 +1099,7 @@
                 <w:sz w:val="19"/>
                 <w:szCs w:val="19"/>
               </w:rPr>
-              <w:t xml:space="preserve">Namespace, Deployment, Service, Ingress, in-cluster Prometheus</w:t>
+              <w:t xml:space="preserve">Serving image; local stack with Prometheus + Grafana</w:t>
             </w:r>
           </w:p>
         </w:tc>
@@ -1094,7 +1133,7 @@
                 <w:sz w:val="19"/>
                 <w:szCs w:val="19"/>
               </w:rPr>
-              <w:t xml:space="preserve">monitoring/</w:t>
+              <w:t xml:space="preserve">k8s/</w:t>
             </w:r>
           </w:p>
         </w:tc>
@@ -1123,7 +1162,7 @@
                 <w:sz w:val="19"/>
                 <w:szCs w:val="19"/>
               </w:rPr>
-              <w:t xml:space="preserve">Prometheus config, Grafana datasource and dashboard</w:t>
+              <w:t xml:space="preserve">Namespace, Deployment, Service, Ingress, in-cluster Prometheus</w:t>
             </w:r>
           </w:p>
         </w:tc>
@@ -1156,7 +1195,7 @@
                 <w:sz w:val="19"/>
                 <w:szCs w:val="19"/>
               </w:rPr>
-              <w:t xml:space="preserve">models/</w:t>
+              <w:t xml:space="preserve">monitoring/</w:t>
             </w:r>
           </w:p>
         </w:tc>
@@ -1184,7 +1223,70 @@
                 <w:sz w:val="19"/>
                 <w:szCs w:val="19"/>
               </w:rPr>
-              <w:t xml:space="preserve">model.joblib (full pipeline) + model.json (metadata)</w:t>
+              <w:t xml:space="preserve">Prometheus config, Grafana datasource and dashboard</w:t>
+            </w:r>
+          </w:p>
+        </w:tc>
+      </w:tr>
+      <w:tr>
+        <w:trPr>
+          <w:tblHeader w:val="false"/>
+        </w:trPr>
+        <w:tc>
+          <w:tcPr>
+            <w:tcW w:type="dxa" w:w="2900"/>
+            <w:tcBorders>
+              <w:top w:val="single" w:color="BFC5CC" w:sz="4"/>
+              <w:left w:val="single" w:color="BFC5CC" w:sz="4"/>
+              <w:bottom w:val="single" w:color="BFC5CC" w:sz="4"/>
+              <w:right w:val="single" w:color="BFC5CC" w:sz="4"/>
+            </w:tcBorders>
+            <w:shd w:fill="F5F7FA" w:val="clear"/>
+            <w:tcMar>
+              <w:top w:type="dxa" w:w="60"/>
+              <w:left w:type="dxa" w:w="100"/>
+              <w:bottom w:type="dxa" w:w="60"/>
+              <w:right w:type="dxa" w:w="100"/>
+            </w:tcMar>
+          </w:tcPr>
+          <w:p>
+            <w:r>
+              <w:rPr>
+                <w:b w:val="false"/>
+                <w:bCs w:val="false"/>
+                <w:sz w:val="19"/>
+                <w:szCs w:val="19"/>
+              </w:rPr>
+              <w:t xml:space="preserve">models/, screenshots/, reports/</w:t>
+            </w:r>
+          </w:p>
+        </w:tc>
+        <w:tc>
+          <w:tcPr>
+            <w:tcW w:type="dxa" w:w="6126"/>
+            <w:tcBorders>
+              <w:top w:val="single" w:color="BFC5CC" w:sz="4"/>
+              <w:left w:val="single" w:color="BFC5CC" w:sz="4"/>
+              <w:bottom w:val="single" w:color="BFC5CC" w:sz="4"/>
+              <w:right w:val="single" w:color="BFC5CC" w:sz="4"/>
+            </w:tcBorders>
+            <w:shd w:fill="F5F7FA" w:val="clear"/>
+            <w:tcMar>
+              <w:top w:type="dxa" w:w="60"/>
+              <w:left w:type="dxa" w:w="100"/>
+              <w:bottom w:type="dxa" w:w="60"/>
+              <w:right w:type="dxa" w:w="100"/>
+            </w:tcMar>
+          </w:tcPr>
+          <w:p>
+            <w:r>
+              <w:rPr>
+                <w:b w:val="false"/>
+                <w:bCs w:val="false"/>
+                <w:sz w:val="19"/>
+                <w:szCs w:val="19"/>
+              </w:rPr>
+              <w:t xml:space="preserve">Model artefact + metadata; report screenshots; this report and figures</w:t>
             </w:r>
           </w:p>
         </w:tc>
@@ -1305,7 +1407,7 @@
       <w:r>
         <w:drawing>
           <wp:inline distT="0" distB="0" distL="0" distR="0">
-            <wp:extent cx="2857500" cy="2286000"/>
+            <wp:extent cx="2190750" cy="1752600"/>
             <wp:effectExtent t="0" r="0" b="0" l="0"/>
             <wp:docPr id="1" name="01_class_balance.png" descr="Figure 2. Class balance: 164 no disease (54%) vs 139 disease (46%)" title="Figure 2. Class balance: 164 no disease (54%) vs 139 disease (46%)"/>
             <wp:cNvGraphicFramePr>
@@ -1330,7 +1432,7 @@
                   <pic:spPr bwMode="auto">
                     <a:xfrm>
                       <a:off x="0" y="0"/>
-                      <a:ext cx="2857500" cy="2286000"/>
+                      <a:ext cx="2190750" cy="1752600"/>
                     </a:xfrm>
                     <a:prstGeom prst="rect">
                       <a:avLst/>
@@ -1375,7 +1477,7 @@
       <w:r>
         <w:drawing>
           <wp:inline distT="0" distB="0" distL="0" distR="0">
-            <wp:extent cx="5715000" cy="3076575"/>
+            <wp:extent cx="4476750" cy="2409825"/>
             <wp:effectExtent t="0" r="0" b="0" l="0"/>
             <wp:docPr id="1" name="03_numeric_histograms.png" descr="Figure 3. Distribution of numeric features by class" title="Figure 3. Distribution of numeric features by class"/>
             <wp:cNvGraphicFramePr>
@@ -1400,7 +1502,7 @@
                   <pic:spPr bwMode="auto">
                     <a:xfrm>
                       <a:off x="0" y="0"/>
-                      <a:ext cx="5715000" cy="3076575"/>
+                      <a:ext cx="4476750" cy="2409825"/>
                     </a:xfrm>
                     <a:prstGeom prst="rect">
                       <a:avLst/>
@@ -1445,7 +1547,7 @@
       <w:r>
         <w:drawing>
           <wp:inline distT="0" distB="0" distL="0" distR="0">
-            <wp:extent cx="4476750" cy="3581400"/>
+            <wp:extent cx="3429000" cy="2743200"/>
             <wp:effectExtent t="0" r="0" b="0" l="0"/>
             <wp:docPr id="1" name="04_correlation_heatmap.png" descr="Figure 4. Pearson correlation matrix" title="Figure 4. Pearson correlation matrix"/>
             <wp:cNvGraphicFramePr>
@@ -1470,7 +1572,7 @@
                   <pic:spPr bwMode="auto">
                     <a:xfrm>
                       <a:off x="0" y="0"/>
-                      <a:ext cx="4476750" cy="3581400"/>
+                      <a:ext cx="3429000" cy="2743200"/>
                     </a:xfrm>
                     <a:prstGeom prst="rect">
                       <a:avLst/>
@@ -1515,7 +1617,7 @@
       <w:r>
         <w:drawing>
           <wp:inline distT="0" distB="0" distL="0" distR="0">
-            <wp:extent cx="5715000" cy="2667000"/>
+            <wp:extent cx="4476750" cy="2085975"/>
             <wp:effectExtent t="0" r="0" b="0" l="0"/>
             <wp:docPr id="1" name="05_disease_rate_by_category.png" descr="Figure 5. Disease rate for each level of the categorical features" title="Figure 5. Disease rate for each level of the categorical features"/>
             <wp:cNvGraphicFramePr>
@@ -1540,7 +1642,7 @@
                   <pic:spPr bwMode="auto">
                     <a:xfrm>
                       <a:off x="0" y="0"/>
-                      <a:ext cx="5715000" cy="2667000"/>
+                      <a:ext cx="4476750" cy="2085975"/>
                     </a:xfrm>
                     <a:prstGeom prst="rect">
                       <a:avLst/>
@@ -1574,7 +1676,7 @@
         <w:spacing w:after="120" w:line="276"/>
       </w:pPr>
       <w:r>
-        <w:t xml:space="preserve">Asymptomatic chest pain (cp = 4), reversible thalassemia defect (thal = 7), exercise angina and one or more coloured vessels each push the disease rate far above the 46% baseline. These are nominal codes rather than ordered quantities, which motivates one-hot encoding cp, restecg, slope and thal rather than treating them as numbers.</w:t>
+        <w:t xml:space="preserve">Asymptomatic chest pain (cp = 4), reversible thalassemia defect (thal = 7), exercise angina and one or more coloured vessels each push the disease rate far above the 46% baseline. These are nominal codes rather than ordered quantities, which motivates one-hot encoding cp, restecg, slope and thal.</w:t>
       </w:r>
     </w:p>
     <w:p>
@@ -2181,7 +2283,7 @@
                 <w:sz w:val="19"/>
                 <w:szCs w:val="19"/>
               </w:rPr>
-              <w:t xml:space="preserve">C ∈ {0.01…5}, L1/L2, class_weight</w:t>
+              <w:t xml:space="preserve">C ∈ {0.01…5}, L1/L2, class_weight (20 combos)</w:t>
             </w:r>
           </w:p>
         </w:tc>
@@ -2209,7 +2311,7 @@
                 <w:sz w:val="19"/>
                 <w:szCs w:val="19"/>
               </w:rPr>
-              <w:t xml:space="preserve">C:0.5,class_weight:balanced,penalty:l2</w:t>
+              <w:t xml:space="preserve">C=0.5, class_weight=balanced, penalty=l2</w:t>
             </w:r>
           </w:p>
         </w:tc>
@@ -3413,7 +3515,7 @@
       <w:r>
         <w:drawing>
           <wp:inline distT="0" distB="0" distL="0" distR="0">
-            <wp:extent cx="2762250" cy="2762250"/>
+            <wp:extent cx="2381250" cy="2381250"/>
             <wp:effectExtent t="0" r="0" b="0" l="0"/>
             <wp:docPr id="1" name="roc_logistic_regression.png" descr="Figure 6. ROC curve of the selected model on the held-out test set" title="Figure 6. ROC curve of the selected model on the held-out test set"/>
             <wp:cNvGraphicFramePr>
@@ -3438,7 +3540,7 @@
                   <pic:spPr bwMode="auto">
                     <a:xfrm>
                       <a:off x="0" y="0"/>
-                      <a:ext cx="2762250" cy="2762250"/>
+                      <a:ext cx="2381250" cy="2381250"/>
                     </a:xfrm>
                     <a:prstGeom prst="rect">
                       <a:avLst/>
@@ -3475,7 +3577,7 @@
       <w:r>
         <w:drawing>
           <wp:inline distT="0" distB="0" distL="0" distR="0">
-            <wp:extent cx="2762250" cy="2457450"/>
+            <wp:extent cx="2381250" cy="2114550"/>
             <wp:effectExtent t="0" r="0" b="0" l="0"/>
             <wp:docPr id="1" name="cm_logistic_regression.png" descr="Figure 7. Confusion matrix of the selected model (threshold 0.5)" title="Figure 7. Confusion matrix of the selected model (threshold 0.5)"/>
             <wp:cNvGraphicFramePr>
@@ -3500,7 +3602,7 @@
                   <pic:spPr bwMode="auto">
                     <a:xfrm>
                       <a:off x="0" y="0"/>
-                      <a:ext cx="2762250" cy="2457450"/>
+                      <a:ext cx="2381250" cy="2114550"/>
                     </a:xfrm>
                     <a:prstGeom prst="rect">
                       <a:avLst/>
@@ -3531,15 +3633,91 @@
     </w:p>
     <w:p>
       <w:pPr>
+        <w:pStyle w:val="Heading1"/>
+      </w:pPr>
+      <w:r>
+        <w:t xml:space="preserve">5. Experiment Tracking</w:t>
+      </w:r>
+    </w:p>
+    <w:p>
+      <w:pPr>
+        <w:spacing w:after="120" w:line="276"/>
+      </w:pPr>
+      <w:r>
+        <w:t xml:space="preserve">MLflow (SQLite backend, local artifact store) records one run per model family under the experiment "heart-disease". Each run logs:</w:t>
+      </w:r>
+    </w:p>
+    <w:p>
+      <w:pPr>
+        <w:pStyle w:val="ListParagraph"/>
+        <w:numPr>
+          <w:ilvl w:val="0"/>
+          <w:numId w:val="2"/>
+        </w:numPr>
+        <w:spacing w:after="60"/>
+      </w:pPr>
+      <w:r>
+        <w:t xml:space="preserve">Parameters: the best hyper-parameters plus split size, number of folds, seed and sample counts.</w:t>
+      </w:r>
+    </w:p>
+    <w:p>
+      <w:pPr>
+        <w:pStyle w:val="ListParagraph"/>
+        <w:numPr>
+          <w:ilvl w:val="0"/>
+          <w:numId w:val="2"/>
+        </w:numPr>
+        <w:spacing w:after="60"/>
+      </w:pPr>
+      <w:r>
+        <w:t xml:space="preserve">Metrics: the mean and standard deviation of each CV metric, all held-out test metrics, and training time.</w:t>
+      </w:r>
+    </w:p>
+    <w:p>
+      <w:pPr>
+        <w:pStyle w:val="ListParagraph"/>
+        <w:numPr>
+          <w:ilvl w:val="0"/>
+          <w:numId w:val="2"/>
+        </w:numPr>
+        <w:spacing w:after="60"/>
+      </w:pPr>
+      <w:r>
+        <w:t xml:space="preserve">Artifacts: ROC curve, confusion matrix and feature-importance plots, and the fitted sklearn pipeline with an input example and inferred signature.</w:t>
+      </w:r>
+    </w:p>
+    <w:p>
+      <w:pPr>
+        <w:pStyle w:val="ListParagraph"/>
+        <w:numPr>
+          <w:ilvl w:val="0"/>
+          <w:numId w:val="2"/>
+        </w:numPr>
+        <w:spacing w:after="60"/>
+      </w:pPr>
+      <w:r>
+        <w:t xml:space="preserve">Tags: model family and grid size.</w:t>
+      </w:r>
+    </w:p>
+    <w:p>
+      <w:pPr>
+        <w:spacing w:after="120" w:line="276"/>
+      </w:pPr>
+      <w:r>
+        <w:t xml:space="preserve">The best run is registered as heart-disease-classifier in the MLflow Model Registry, so every deployed model can be traced back to the run, parameters and data that produced it.</w:t>
+      </w:r>
+    </w:p>
+    <w:p>
+      <w:pPr>
         <w:spacing w:after="40"/>
         <w:jc w:val="center"/>
       </w:pPr>
       <w:r>
         <w:drawing>
           <wp:inline distT="0" distB="0" distL="0" distR="0">
-            <wp:extent cx="3619500" cy="3019425"/>
+            <wp:extent cx="5334000" cy="2466975"/>
             <wp:effectExtent t="0" r="0" b="0" l="0"/>
-            <wp:docPr id="1" name="importance_logistic_regression.png" descr="Figure 8. Largest absolute coefficients of the selected model" title="Figure 8. Largest absolute coefficients of the selected model"/>
+            <wp:docPr id="1" name="mlflow_runs.jpg" descr="Figure 8. MLflow experiment comparing the three runs" title="Figure 8. MLflow experiment comparing the three runs"/>
             <wp:cNvGraphicFramePr>
               <a:graphicFrameLocks xmlns:a="http://schemas.openxmlformats.org/drawingml/2006/main" noChangeAspect="1"/>
             </wp:cNvGraphicFramePr>
@@ -3562,7 +3740,7 @@
                   <pic:spPr bwMode="auto">
                     <a:xfrm>
                       <a:off x="0" y="0"/>
-                      <a:ext cx="3619500" cy="3019425"/>
+                      <a:ext cx="5334000" cy="2466975"/>
                     </a:xfrm>
                     <a:prstGeom prst="rect">
                       <a:avLst/>
@@ -3588,7 +3766,7 @@
           <w:sz w:val="18"/>
           <w:szCs w:val="18"/>
         </w:rPr>
-        <w:t xml:space="preserve">Figure 8. Largest absolute coefficients of the selected model</w:t>
+        <w:t xml:space="preserve">Figure 8. MLflow experiment comparing the three runs</w:t>
       </w:r>
     </w:p>
     <w:p>
@@ -3596,15 +3774,7 @@
         <w:pStyle w:val="Heading1"/>
       </w:pPr>
       <w:r>
-        <w:t xml:space="preserve">5. Experiment Tracking</w:t>
-      </w:r>
-    </w:p>
-    <w:p>
-      <w:pPr>
-        <w:spacing w:after="120" w:line="276"/>
-      </w:pPr>
-      <w:r>
-        <w:t xml:space="preserve">MLflow (SQLite backend, local artifact store) records one run per model family under the experiment "heart-disease". Each run logs:</w:t>
+        <w:t xml:space="preserve">6. Model Packaging and Reproducibility</w:t>
       </w:r>
     </w:p>
     <w:p>
@@ -3617,7 +3787,17 @@
         <w:spacing w:after="60"/>
       </w:pPr>
       <w:r>
-        <w:t xml:space="preserve">Parameters: the best hyper-parameters plus split size, number of folds, seed and sample counts.</w:t>
+        <w:t xml:space="preserve">The full Pipeline (preprocessing + classifier) is saved with joblib to </w:t>
+      </w:r>
+      <w:r>
+        <w:rPr>
+          <w:b/>
+          <w:bCs/>
+        </w:rPr>
+        <w:t xml:space="preserve">models/model.joblib</w:t>
+      </w:r>
+      <w:r>
+        <w:t xml:space="preserve">, so serving needs no separate preprocessing code.</w:t>
       </w:r>
     </w:p>
     <w:p>
@@ -3630,7 +3810,17 @@
         <w:spacing w:after="60"/>
       </w:pPr>
       <w:r>
-        <w:t xml:space="preserve">Metrics: the mean and standard deviation of each CV metric, all held-out test metrics, and training time.</w:t>
+        <w:t xml:space="preserve">A </w:t>
+      </w:r>
+      <w:r>
+        <w:rPr>
+          <w:b/>
+          <w:bCs/>
+        </w:rPr>
+        <w:t xml:space="preserve">models/model.json</w:t>
+      </w:r>
+      <w:r>
+        <w:t xml:space="preserve"> sidecar stores the model name, hyper-parameters, all metrics, feature order, sklearn version, training timestamp and MLflow run id. The API reports this metadata.</w:t>
       </w:r>
     </w:p>
     <w:p>
@@ -3643,7 +3833,7 @@
         <w:spacing w:after="60"/>
       </w:pPr>
       <w:r>
-        <w:t xml:space="preserve">Artifacts: ROC curve, confusion matrix and feature-importance plots, and the fitted sklearn pipeline with an input example and inferred signature.</w:t>
+        <w:t xml:space="preserve">The model is also logged in MLflow format, so it can be loaded with mlflow.pyfunc.</w:t>
       </w:r>
     </w:p>
     <w:p>
@@ -3656,7 +3846,36 @@
         <w:spacing w:after="60"/>
       </w:pPr>
       <w:r>
-        <w:t xml:space="preserve">Tags: model family and grid size.</w:t>
+        <w:t xml:space="preserve">All dependencies are pinned to exact versions. The serving image installs only the 8 runtime packages, which keeps it small.</w:t>
+      </w:r>
+    </w:p>
+    <w:p>
+      <w:pPr>
+        <w:pStyle w:val="ListParagraph"/>
+        <w:numPr>
+          <w:ilvl w:val="0"/>
+          <w:numId w:val="2"/>
+        </w:numPr>
+        <w:spacing w:after="60"/>
+      </w:pPr>
+      <w:r>
+        <w:t xml:space="preserve">A fixed random seed (42) is used for splitting, CV folds and models, so re-running training gives identical results.</w:t>
+      </w:r>
+    </w:p>
+    <w:p>
+      <w:pPr>
+        <w:pStyle w:val="Heading1"/>
+      </w:pPr>
+      <w:r>
+        <w:t xml:space="preserve">7. CI/CD Pipeline and Automated Testing</w:t>
+      </w:r>
+    </w:p>
+    <w:p>
+      <w:pPr>
+        <w:pStyle w:val="Heading2"/>
+      </w:pPr>
+      <w:r>
+        <w:t xml:space="preserve">7.1 Unit tests</w:t>
       </w:r>
     </w:p>
     <w:p>
@@ -3664,8 +3883,548 @@
         <w:spacing w:after="120" w:line="276"/>
       </w:pPr>
       <w:r>
-        <w:t xml:space="preserve">The best run is registered as heart-disease-classifier in the MLflow Model Registry, so every deployed model can be traced back to the run, parameters and data that produced it. The UI is launched with: mlflow ui --backend-store-uri sqlite:///mlflow.db.</w:t>
-      </w:r>
+        <w:t xml:space="preserve">tests/ contains 24 pytest tests, which run in under 2 seconds against synthetic fixtures, so CI does not depend on the network:</w:t>
+      </w:r>
+    </w:p>
+    <w:p>
+      <w:pPr>
+        <w:pStyle w:val="ListParagraph"/>
+        <w:numPr>
+          <w:ilvl w:val="0"/>
+          <w:numId w:val="2"/>
+        </w:numPr>
+        <w:spacing w:after="60"/>
+      </w:pPr>
+      <w:r>
+        <w:t xml:space="preserve">Data: binary target creation, invalid codes are nulled, missing values are preserved for the pipeline, duplicates are dropped, and "?" is parsed as missing.</w:t>
+      </w:r>
+    </w:p>
+    <w:p>
+      <w:pPr>
+        <w:pStyle w:val="ListParagraph"/>
+        <w:numPr>
+          <w:ilvl w:val="0"/>
+          <w:numId w:val="2"/>
+        </w:numPr>
+        <w:spacing w:after="60"/>
+      </w:pPr>
+      <w:r>
+        <w:t xml:space="preserve">Features and models: the preprocessor output contains no NaNs, unseen categories are handled, each model family fits and returns valid probabilities, and predict_records returns the expected output shape.</w:t>
+      </w:r>
+    </w:p>
+    <w:p>
+      <w:pPr>
+        <w:pStyle w:val="ListParagraph"/>
+        <w:numPr>
+          <w:ilvl w:val="0"/>
+          <w:numId w:val="2"/>
+        </w:numPr>
+        <w:spacing w:after="60"/>
+      </w:pPr>
+      <w:r>
+        <w:t xml:space="preserve">Quality gate: the trained artefact must reach a test ROC-AUC of at least 0.80.</w:t>
+      </w:r>
+    </w:p>
+    <w:p>
+      <w:pPr>
+        <w:pStyle w:val="ListParagraph"/>
+        <w:numPr>
+          <w:ilvl w:val="0"/>
+          <w:numId w:val="2"/>
+        </w:numPr>
+        <w:spacing w:after="60"/>
+      </w:pPr>
+      <w:r>
+        <w:t xml:space="preserve">API: /health, /predict (including null ca/thal), rejection of invalid inputs with 422, batch prediction, and the Prometheus metrics endpoint.</w:t>
+      </w:r>
+    </w:p>
+    <w:p>
+      <w:pPr>
+        <w:pStyle w:val="Heading2"/>
+      </w:pPr>
+      <w:r>
+        <w:t xml:space="preserve">7.2 GitHub Actions workflow</w:t>
+      </w:r>
+    </w:p>
+    <w:tbl>
+      <w:tblPr>
+        <w:tblW w:type="dxa" w:w="9026"/>
+        <w:tblBorders>
+          <w:top w:val="single" w:color="auto" w:sz="4"/>
+          <w:left w:val="single" w:color="auto" w:sz="4"/>
+          <w:bottom w:val="single" w:color="auto" w:sz="4"/>
+          <w:right w:val="single" w:color="auto" w:sz="4"/>
+          <w:insideH w:val="single" w:color="auto" w:sz="4"/>
+          <w:insideV w:val="single" w:color="auto" w:sz="4"/>
+        </w:tblBorders>
+      </w:tblPr>
+      <w:tblGrid>
+        <w:gridCol w:w="1100"/>
+        <w:gridCol w:w="5300"/>
+        <w:gridCol w:w="2626"/>
+      </w:tblGrid>
+      <w:tr>
+        <w:trPr>
+          <w:tblHeader/>
+        </w:trPr>
+        <w:tc>
+          <w:tcPr>
+            <w:tcW w:type="dxa" w:w="1100"/>
+            <w:tcBorders>
+              <w:top w:val="single" w:color="BFC5CC" w:sz="4"/>
+              <w:left w:val="single" w:color="BFC5CC" w:sz="4"/>
+              <w:bottom w:val="single" w:color="BFC5CC" w:sz="4"/>
+              <w:right w:val="single" w:color="BFC5CC" w:sz="4"/>
+            </w:tcBorders>
+            <w:shd w:fill="1F3B5C" w:val="clear"/>
+            <w:tcMar>
+              <w:top w:type="dxa" w:w="60"/>
+              <w:left w:type="dxa" w:w="100"/>
+              <w:bottom w:type="dxa" w:w="60"/>
+              <w:right w:type="dxa" w:w="100"/>
+            </w:tcMar>
+          </w:tcPr>
+          <w:p>
+            <w:r>
+              <w:rPr>
+                <w:b/>
+                <w:bCs/>
+                <w:color w:val="FFFFFF"/>
+                <w:sz w:val="19"/>
+                <w:szCs w:val="19"/>
+              </w:rPr>
+              <w:t xml:space="preserve">Job</w:t>
+            </w:r>
+          </w:p>
+        </w:tc>
+        <w:tc>
+          <w:tcPr>
+            <w:tcW w:type="dxa" w:w="5300"/>
+            <w:tcBorders>
+              <w:top w:val="single" w:color="BFC5CC" w:sz="4"/>
+              <w:left w:val="single" w:color="BFC5CC" w:sz="4"/>
+              <w:bottom w:val="single" w:color="BFC5CC" w:sz="4"/>
+              <w:right w:val="single" w:color="BFC5CC" w:sz="4"/>
+            </w:tcBorders>
+            <w:shd w:fill="1F3B5C" w:val="clear"/>
+            <w:tcMar>
+              <w:top w:type="dxa" w:w="60"/>
+              <w:left w:type="dxa" w:w="100"/>
+              <w:bottom w:type="dxa" w:w="60"/>
+              <w:right w:type="dxa" w:w="100"/>
+            </w:tcMar>
+          </w:tcPr>
+          <w:p>
+            <w:r>
+              <w:rPr>
+                <w:b/>
+                <w:bCs/>
+                <w:color w:val="FFFFFF"/>
+                <w:sz w:val="19"/>
+                <w:szCs w:val="19"/>
+              </w:rPr>
+              <w:t xml:space="preserve">Steps</w:t>
+            </w:r>
+          </w:p>
+        </w:tc>
+        <w:tc>
+          <w:tcPr>
+            <w:tcW w:type="dxa" w:w="2626"/>
+            <w:tcBorders>
+              <w:top w:val="single" w:color="BFC5CC" w:sz="4"/>
+              <w:left w:val="single" w:color="BFC5CC" w:sz="4"/>
+              <w:bottom w:val="single" w:color="BFC5CC" w:sz="4"/>
+              <w:right w:val="single" w:color="BFC5CC" w:sz="4"/>
+            </w:tcBorders>
+            <w:shd w:fill="1F3B5C" w:val="clear"/>
+            <w:tcMar>
+              <w:top w:type="dxa" w:w="60"/>
+              <w:left w:type="dxa" w:w="100"/>
+              <w:bottom w:type="dxa" w:w="60"/>
+              <w:right w:type="dxa" w:w="100"/>
+            </w:tcMar>
+          </w:tcPr>
+          <w:p>
+            <w:r>
+              <w:rPr>
+                <w:b/>
+                <w:bCs/>
+                <w:color w:val="FFFFFF"/>
+                <w:sz w:val="19"/>
+                <w:szCs w:val="19"/>
+              </w:rPr>
+              <w:t xml:space="preserve">Fails when</w:t>
+            </w:r>
+          </w:p>
+        </w:tc>
+      </w:tr>
+      <w:tr>
+        <w:trPr>
+          <w:tblHeader w:val="false"/>
+        </w:trPr>
+        <w:tc>
+          <w:tcPr>
+            <w:tcW w:type="dxa" w:w="1100"/>
+            <w:tcBorders>
+              <w:top w:val="single" w:color="BFC5CC" w:sz="4"/>
+              <w:left w:val="single" w:color="BFC5CC" w:sz="4"/>
+              <w:bottom w:val="single" w:color="BFC5CC" w:sz="4"/>
+              <w:right w:val="single" w:color="BFC5CC" w:sz="4"/>
+            </w:tcBorders>
+            <w:tcMar>
+              <w:top w:type="dxa" w:w="60"/>
+              <w:left w:type="dxa" w:w="100"/>
+              <w:bottom w:type="dxa" w:w="60"/>
+              <w:right w:type="dxa" w:w="100"/>
+            </w:tcMar>
+          </w:tcPr>
+          <w:p>
+            <w:r>
+              <w:rPr>
+                <w:b w:val="false"/>
+                <w:bCs w:val="false"/>
+                <w:sz w:val="19"/>
+                <w:szCs w:val="19"/>
+              </w:rPr>
+              <w:t xml:space="preserve">lint</w:t>
+            </w:r>
+          </w:p>
+        </w:tc>
+        <w:tc>
+          <w:tcPr>
+            <w:tcW w:type="dxa" w:w="5300"/>
+            <w:tcBorders>
+              <w:top w:val="single" w:color="BFC5CC" w:sz="4"/>
+              <w:left w:val="single" w:color="BFC5CC" w:sz="4"/>
+              <w:bottom w:val="single" w:color="BFC5CC" w:sz="4"/>
+              <w:right w:val="single" w:color="BFC5CC" w:sz="4"/>
+            </w:tcBorders>
+            <w:tcMar>
+              <w:top w:type="dxa" w:w="60"/>
+              <w:left w:type="dxa" w:w="100"/>
+              <w:bottom w:type="dxa" w:w="60"/>
+              <w:right w:type="dxa" w:w="100"/>
+            </w:tcMar>
+          </w:tcPr>
+          <w:p>
+            <w:r>
+              <w:rPr>
+                <w:b w:val="false"/>
+                <w:bCs w:val="false"/>
+                <w:sz w:val="19"/>
+                <w:szCs w:val="19"/>
+              </w:rPr>
+              <w:t xml:space="preserve">flake8 (max line 120)</w:t>
+            </w:r>
+          </w:p>
+        </w:tc>
+        <w:tc>
+          <w:tcPr>
+            <w:tcW w:type="dxa" w:w="2626"/>
+            <w:tcBorders>
+              <w:top w:val="single" w:color="BFC5CC" w:sz="4"/>
+              <w:left w:val="single" w:color="BFC5CC" w:sz="4"/>
+              <w:bottom w:val="single" w:color="BFC5CC" w:sz="4"/>
+              <w:right w:val="single" w:color="BFC5CC" w:sz="4"/>
+            </w:tcBorders>
+            <w:tcMar>
+              <w:top w:type="dxa" w:w="60"/>
+              <w:left w:type="dxa" w:w="100"/>
+              <w:bottom w:type="dxa" w:w="60"/>
+              <w:right w:type="dxa" w:w="100"/>
+            </w:tcMar>
+          </w:tcPr>
+          <w:p>
+            <w:r>
+              <w:rPr>
+                <w:b w:val="false"/>
+                <w:bCs w:val="false"/>
+                <w:sz w:val="19"/>
+                <w:szCs w:val="19"/>
+              </w:rPr>
+              <w:t xml:space="preserve">any style or syntax error</w:t>
+            </w:r>
+          </w:p>
+        </w:tc>
+      </w:tr>
+      <w:tr>
+        <w:trPr>
+          <w:tblHeader w:val="false"/>
+        </w:trPr>
+        <w:tc>
+          <w:tcPr>
+            <w:tcW w:type="dxa" w:w="1100"/>
+            <w:tcBorders>
+              <w:top w:val="single" w:color="BFC5CC" w:sz="4"/>
+              <w:left w:val="single" w:color="BFC5CC" w:sz="4"/>
+              <w:bottom w:val="single" w:color="BFC5CC" w:sz="4"/>
+              <w:right w:val="single" w:color="BFC5CC" w:sz="4"/>
+            </w:tcBorders>
+            <w:shd w:fill="F5F7FA" w:val="clear"/>
+            <w:tcMar>
+              <w:top w:type="dxa" w:w="60"/>
+              <w:left w:type="dxa" w:w="100"/>
+              <w:bottom w:type="dxa" w:w="60"/>
+              <w:right w:type="dxa" w:w="100"/>
+            </w:tcMar>
+          </w:tcPr>
+          <w:p>
+            <w:r>
+              <w:rPr>
+                <w:b w:val="false"/>
+                <w:bCs w:val="false"/>
+                <w:sz w:val="19"/>
+                <w:szCs w:val="19"/>
+              </w:rPr>
+              <w:t xml:space="preserve">test</w:t>
+            </w:r>
+          </w:p>
+        </w:tc>
+        <w:tc>
+          <w:tcPr>
+            <w:tcW w:type="dxa" w:w="5300"/>
+            <w:tcBorders>
+              <w:top w:val="single" w:color="BFC5CC" w:sz="4"/>
+              <w:left w:val="single" w:color="BFC5CC" w:sz="4"/>
+              <w:bottom w:val="single" w:color="BFC5CC" w:sz="4"/>
+              <w:right w:val="single" w:color="BFC5CC" w:sz="4"/>
+            </w:tcBorders>
+            <w:shd w:fill="F5F7FA" w:val="clear"/>
+            <w:tcMar>
+              <w:top w:type="dxa" w:w="60"/>
+              <w:left w:type="dxa" w:w="100"/>
+              <w:bottom w:type="dxa" w:w="60"/>
+              <w:right w:type="dxa" w:w="100"/>
+            </w:tcMar>
+          </w:tcPr>
+          <w:p>
+            <w:r>
+              <w:rPr>
+                <w:b w:val="false"/>
+                <w:bCs w:val="false"/>
+                <w:sz w:val="19"/>
+                <w:szCs w:val="19"/>
+              </w:rPr>
+              <w:t xml:space="preserve">pytest with coverage; JUnit and coverage XML uploaded as artifacts</w:t>
+            </w:r>
+          </w:p>
+        </w:tc>
+        <w:tc>
+          <w:tcPr>
+            <w:tcW w:type="dxa" w:w="2626"/>
+            <w:tcBorders>
+              <w:top w:val="single" w:color="BFC5CC" w:sz="4"/>
+              <w:left w:val="single" w:color="BFC5CC" w:sz="4"/>
+              <w:bottom w:val="single" w:color="BFC5CC" w:sz="4"/>
+              <w:right w:val="single" w:color="BFC5CC" w:sz="4"/>
+            </w:tcBorders>
+            <w:shd w:fill="F5F7FA" w:val="clear"/>
+            <w:tcMar>
+              <w:top w:type="dxa" w:w="60"/>
+              <w:left w:type="dxa" w:w="100"/>
+              <w:bottom w:type="dxa" w:w="60"/>
+              <w:right w:type="dxa" w:w="100"/>
+            </w:tcMar>
+          </w:tcPr>
+          <w:p>
+            <w:r>
+              <w:rPr>
+                <w:b w:val="false"/>
+                <w:bCs w:val="false"/>
+                <w:sz w:val="19"/>
+                <w:szCs w:val="19"/>
+              </w:rPr>
+              <w:t xml:space="preserve">any test fails</w:t>
+            </w:r>
+          </w:p>
+        </w:tc>
+      </w:tr>
+      <w:tr>
+        <w:trPr>
+          <w:tblHeader w:val="false"/>
+        </w:trPr>
+        <w:tc>
+          <w:tcPr>
+            <w:tcW w:type="dxa" w:w="1100"/>
+            <w:tcBorders>
+              <w:top w:val="single" w:color="BFC5CC" w:sz="4"/>
+              <w:left w:val="single" w:color="BFC5CC" w:sz="4"/>
+              <w:bottom w:val="single" w:color="BFC5CC" w:sz="4"/>
+              <w:right w:val="single" w:color="BFC5CC" w:sz="4"/>
+            </w:tcBorders>
+            <w:tcMar>
+              <w:top w:type="dxa" w:w="60"/>
+              <w:left w:type="dxa" w:w="100"/>
+              <w:bottom w:type="dxa" w:w="60"/>
+              <w:right w:type="dxa" w:w="100"/>
+            </w:tcMar>
+          </w:tcPr>
+          <w:p>
+            <w:r>
+              <w:rPr>
+                <w:b w:val="false"/>
+                <w:bCs w:val="false"/>
+                <w:sz w:val="19"/>
+                <w:szCs w:val="19"/>
+              </w:rPr>
+              <w:t xml:space="preserve">train</w:t>
+            </w:r>
+          </w:p>
+        </w:tc>
+        <w:tc>
+          <w:tcPr>
+            <w:tcW w:type="dxa" w:w="5300"/>
+            <w:tcBorders>
+              <w:top w:val="single" w:color="BFC5CC" w:sz="4"/>
+              <w:left w:val="single" w:color="BFC5CC" w:sz="4"/>
+              <w:bottom w:val="single" w:color="BFC5CC" w:sz="4"/>
+              <w:right w:val="single" w:color="BFC5CC" w:sz="4"/>
+            </w:tcBorders>
+            <w:tcMar>
+              <w:top w:type="dxa" w:w="60"/>
+              <w:left w:type="dxa" w:w="100"/>
+              <w:bottom w:type="dxa" w:w="60"/>
+              <w:right w:type="dxa" w:w="100"/>
+            </w:tcMar>
+          </w:tcPr>
+          <w:p>
+            <w:r>
+              <w:rPr>
+                <w:b w:val="false"/>
+                <w:bCs w:val="false"/>
+                <w:sz w:val="19"/>
+                <w:szCs w:val="19"/>
+              </w:rPr>
+              <w:t xml:space="preserve">download data → EDA → train with MLflow → quality gate; model, MLflow DB and figures uploaded</w:t>
+            </w:r>
+          </w:p>
+        </w:tc>
+        <w:tc>
+          <w:tcPr>
+            <w:tcW w:type="dxa" w:w="2626"/>
+            <w:tcBorders>
+              <w:top w:val="single" w:color="BFC5CC" w:sz="4"/>
+              <w:left w:val="single" w:color="BFC5CC" w:sz="4"/>
+              <w:bottom w:val="single" w:color="BFC5CC" w:sz="4"/>
+              <w:right w:val="single" w:color="BFC5CC" w:sz="4"/>
+            </w:tcBorders>
+            <w:tcMar>
+              <w:top w:type="dxa" w:w="60"/>
+              <w:left w:type="dxa" w:w="100"/>
+              <w:bottom w:type="dxa" w:w="60"/>
+              <w:right w:type="dxa" w:w="100"/>
+            </w:tcMar>
+          </w:tcPr>
+          <w:p>
+            <w:r>
+              <w:rPr>
+                <w:b w:val="false"/>
+                <w:bCs w:val="false"/>
+                <w:sz w:val="19"/>
+                <w:szCs w:val="19"/>
+              </w:rPr>
+              <w:t xml:space="preserve">training error or ROC-AUC &lt; 0.80</w:t>
+            </w:r>
+          </w:p>
+        </w:tc>
+      </w:tr>
+      <w:tr>
+        <w:trPr>
+          <w:tblHeader w:val="false"/>
+        </w:trPr>
+        <w:tc>
+          <w:tcPr>
+            <w:tcW w:type="dxa" w:w="1100"/>
+            <w:tcBorders>
+              <w:top w:val="single" w:color="BFC5CC" w:sz="4"/>
+              <w:left w:val="single" w:color="BFC5CC" w:sz="4"/>
+              <w:bottom w:val="single" w:color="BFC5CC" w:sz="4"/>
+              <w:right w:val="single" w:color="BFC5CC" w:sz="4"/>
+            </w:tcBorders>
+            <w:shd w:fill="F5F7FA" w:val="clear"/>
+            <w:tcMar>
+              <w:top w:type="dxa" w:w="60"/>
+              <w:left w:type="dxa" w:w="100"/>
+              <w:bottom w:type="dxa" w:w="60"/>
+              <w:right w:type="dxa" w:w="100"/>
+            </w:tcMar>
+          </w:tcPr>
+          <w:p>
+            <w:r>
+              <w:rPr>
+                <w:b w:val="false"/>
+                <w:bCs w:val="false"/>
+                <w:sz w:val="19"/>
+                <w:szCs w:val="19"/>
+              </w:rPr>
+              <w:t xml:space="preserve">docker</w:t>
+            </w:r>
+          </w:p>
+        </w:tc>
+        <w:tc>
+          <w:tcPr>
+            <w:tcW w:type="dxa" w:w="5300"/>
+            <w:tcBorders>
+              <w:top w:val="single" w:color="BFC5CC" w:sz="4"/>
+              <w:left w:val="single" w:color="BFC5CC" w:sz="4"/>
+              <w:bottom w:val="single" w:color="BFC5CC" w:sz="4"/>
+              <w:right w:val="single" w:color="BFC5CC" w:sz="4"/>
+            </w:tcBorders>
+            <w:shd w:fill="F5F7FA" w:val="clear"/>
+            <w:tcMar>
+              <w:top w:type="dxa" w:w="60"/>
+              <w:left w:type="dxa" w:w="100"/>
+              <w:bottom w:type="dxa" w:w="60"/>
+              <w:right w:type="dxa" w:w="100"/>
+            </w:tcMar>
+          </w:tcPr>
+          <w:p>
+            <w:r>
+              <w:rPr>
+                <w:b w:val="false"/>
+                <w:bCs w:val="false"/>
+                <w:sz w:val="19"/>
+                <w:szCs w:val="19"/>
+              </w:rPr>
+              <w:t xml:space="preserve">build image with the CI-trained model, run it, curl /health and /predict, print logs; push to GHCR on main</w:t>
+            </w:r>
+          </w:p>
+        </w:tc>
+        <w:tc>
+          <w:tcPr>
+            <w:tcW w:type="dxa" w:w="2626"/>
+            <w:tcBorders>
+              <w:top w:val="single" w:color="BFC5CC" w:sz="4"/>
+              <w:left w:val="single" w:color="BFC5CC" w:sz="4"/>
+              <w:bottom w:val="single" w:color="BFC5CC" w:sz="4"/>
+              <w:right w:val="single" w:color="BFC5CC" w:sz="4"/>
+            </w:tcBorders>
+            <w:shd w:fill="F5F7FA" w:val="clear"/>
+            <w:tcMar>
+              <w:top w:type="dxa" w:w="60"/>
+              <w:left w:type="dxa" w:w="100"/>
+              <w:bottom w:type="dxa" w:w="60"/>
+              <w:right w:type="dxa" w:w="100"/>
+            </w:tcMar>
+          </w:tcPr>
+          <w:p>
+            <w:r>
+              <w:rPr>
+                <w:b w:val="false"/>
+                <w:bCs w:val="false"/>
+                <w:sz w:val="19"/>
+                <w:szCs w:val="19"/>
+              </w:rPr>
+              <w:t xml:space="preserve">build error or failed smoke test</w:t>
+            </w:r>
+          </w:p>
+        </w:tc>
+      </w:tr>
+    </w:tbl>
+    <w:p>
+      <w:pPr>
+        <w:spacing w:after="160"/>
+      </w:pPr>
     </w:p>
     <w:p>
       <w:pPr>
@@ -3675,9 +4434,9 @@
       <w:r>
         <w:drawing>
           <wp:inline distT="0" distB="0" distL="0" distR="0">
-            <wp:extent cx="5715000" cy="2647950"/>
+            <wp:extent cx="5334000" cy="2466975"/>
             <wp:effectExtent t="0" r="0" b="0" l="0"/>
-            <wp:docPr id="1" name="mlflow_runs.jpg" descr="Figure 9. MLflow experiment comparing the three runs" title="Figure 9. MLflow experiment comparing the three runs"/>
+            <wp:docPr id="1" name="ci_success.jpg" descr="Figure 9. Successful GitHub Actions run (lint → test → train → docker)" title="Figure 9. Successful GitHub Actions run (lint → test → train → docker)"/>
             <wp:cNvGraphicFramePr>
               <a:graphicFrameLocks xmlns:a="http://schemas.openxmlformats.org/drawingml/2006/main" noChangeAspect="1"/>
             </wp:cNvGraphicFramePr>
@@ -3700,7 +4459,7 @@
                   <pic:spPr bwMode="auto">
                     <a:xfrm>
                       <a:off x="0" y="0"/>
-                      <a:ext cx="5715000" cy="2647950"/>
+                      <a:ext cx="5334000" cy="2466975"/>
                     </a:xfrm>
                     <a:prstGeom prst="rect">
                       <a:avLst/>
@@ -3726,7 +4485,7 @@
           <w:sz w:val="18"/>
           <w:szCs w:val="18"/>
         </w:rPr>
-        <w:t xml:space="preserve">Figure 9. MLflow experiment comparing the three runs</w:t>
+        <w:t xml:space="preserve">Figure 9. Successful GitHub Actions run (lint → test → train → docker)</w:t>
       </w:r>
     </w:p>
     <w:p>
@@ -3734,108 +4493,7 @@
         <w:pStyle w:val="Heading1"/>
       </w:pPr>
       <w:r>
-        <w:t xml:space="preserve">6. Model Packaging and Reproducibility</w:t>
-      </w:r>
-    </w:p>
-    <w:p>
-      <w:pPr>
-        <w:pStyle w:val="ListParagraph"/>
-        <w:numPr>
-          <w:ilvl w:val="0"/>
-          <w:numId w:val="2"/>
-        </w:numPr>
-        <w:spacing w:after="60"/>
-      </w:pPr>
-      <w:r>
-        <w:t xml:space="preserve">The full Pipeline (preprocessing + classifier) is saved with joblib to </w:t>
-      </w:r>
-      <w:r>
-        <w:rPr>
-          <w:b/>
-          <w:bCs/>
-        </w:rPr>
-        <w:t xml:space="preserve">models/model.joblib</w:t>
-      </w:r>
-      <w:r>
-        <w:t xml:space="preserve">, so serving needs no separate preprocessing code.</w:t>
-      </w:r>
-    </w:p>
-    <w:p>
-      <w:pPr>
-        <w:pStyle w:val="ListParagraph"/>
-        <w:numPr>
-          <w:ilvl w:val="0"/>
-          <w:numId w:val="2"/>
-        </w:numPr>
-        <w:spacing w:after="60"/>
-      </w:pPr>
-      <w:r>
-        <w:t xml:space="preserve">A </w:t>
-      </w:r>
-      <w:r>
-        <w:rPr>
-          <w:b/>
-          <w:bCs/>
-        </w:rPr>
-        <w:t xml:space="preserve">models/model.json</w:t>
-      </w:r>
-      <w:r>
-        <w:t xml:space="preserve"> sidecar stores the model name, hyper-parameters, all metrics, feature order, sklearn version, training timestamp and MLflow run id. The API reports this metadata.</w:t>
-      </w:r>
-    </w:p>
-    <w:p>
-      <w:pPr>
-        <w:pStyle w:val="ListParagraph"/>
-        <w:numPr>
-          <w:ilvl w:val="0"/>
-          <w:numId w:val="2"/>
-        </w:numPr>
-        <w:spacing w:after="60"/>
-      </w:pPr>
-      <w:r>
-        <w:t xml:space="preserve">The model is also logged in MLflow format, so it can be loaded with mlflow.pyfunc.</w:t>
-      </w:r>
-    </w:p>
-    <w:p>
-      <w:pPr>
-        <w:pStyle w:val="ListParagraph"/>
-        <w:numPr>
-          <w:ilvl w:val="0"/>
-          <w:numId w:val="2"/>
-        </w:numPr>
-        <w:spacing w:after="60"/>
-      </w:pPr>
-      <w:r>
-        <w:t xml:space="preserve">All dependencies are pinned to exact versions. The serving image installs only the 8 runtime packages, which keeps it small.</w:t>
-      </w:r>
-    </w:p>
-    <w:p>
-      <w:pPr>
-        <w:pStyle w:val="ListParagraph"/>
-        <w:numPr>
-          <w:ilvl w:val="0"/>
-          <w:numId w:val="2"/>
-        </w:numPr>
-        <w:spacing w:after="60"/>
-      </w:pPr>
-      <w:r>
-        <w:t xml:space="preserve">A fixed random seed (42) is used for splitting, CV folds and models, so re-running training gives identical results.</w:t>
-      </w:r>
-    </w:p>
-    <w:p>
-      <w:pPr>
-        <w:pStyle w:val="Heading1"/>
-      </w:pPr>
-      <w:r>
-        <w:t xml:space="preserve">7. CI/CD Pipeline and Automated Testing</w:t>
-      </w:r>
-    </w:p>
-    <w:p>
-      <w:pPr>
-        <w:pStyle w:val="Heading2"/>
-      </w:pPr>
-      <w:r>
-        <w:t xml:space="preserve">7.1 Unit tests</w:t>
+        <w:t xml:space="preserve">8. Model Containerisation</w:t>
       </w:r>
     </w:p>
     <w:p>
@@ -3843,67 +4501,7 @@
         <w:spacing w:after="120" w:line="276"/>
       </w:pPr>
       <w:r>
-        <w:t xml:space="preserve">tests/ contains 24 pytest tests, which run in under 2 seconds against synthetic fixtures, so CI does not depend on the network:</w:t>
-      </w:r>
-    </w:p>
-    <w:p>
-      <w:pPr>
-        <w:pStyle w:val="ListParagraph"/>
-        <w:numPr>
-          <w:ilvl w:val="0"/>
-          <w:numId w:val="2"/>
-        </w:numPr>
-        <w:spacing w:after="60"/>
-      </w:pPr>
-      <w:r>
-        <w:t xml:space="preserve">Data: binary target creation, invalid codes are nulled, missing values are preserved for the pipeline, duplicates are dropped, and "?" is parsed as missing.</w:t>
-      </w:r>
-    </w:p>
-    <w:p>
-      <w:pPr>
-        <w:pStyle w:val="ListParagraph"/>
-        <w:numPr>
-          <w:ilvl w:val="0"/>
-          <w:numId w:val="2"/>
-        </w:numPr>
-        <w:spacing w:after="60"/>
-      </w:pPr>
-      <w:r>
-        <w:t xml:space="preserve">Features and models: the preprocessor output contains no NaNs, unseen categories are handled, each model family fits and returns valid probabilities, and predict_records returns the expected output shape.</w:t>
-      </w:r>
-    </w:p>
-    <w:p>
-      <w:pPr>
-        <w:pStyle w:val="ListParagraph"/>
-        <w:numPr>
-          <w:ilvl w:val="0"/>
-          <w:numId w:val="2"/>
-        </w:numPr>
-        <w:spacing w:after="60"/>
-      </w:pPr>
-      <w:r>
-        <w:t xml:space="preserve">Quality gate: the trained artefact must reach a test ROC-AUC of at least 0.80.</w:t>
-      </w:r>
-    </w:p>
-    <w:p>
-      <w:pPr>
-        <w:pStyle w:val="ListParagraph"/>
-        <w:numPr>
-          <w:ilvl w:val="0"/>
-          <w:numId w:val="2"/>
-        </w:numPr>
-        <w:spacing w:after="60"/>
-      </w:pPr>
-      <w:r>
-        <w:t xml:space="preserve">API: /health, /predict (including null ca/thal), rejection of invalid inputs with 422, batch prediction, and the Prometheus metrics endpoint.</w:t>
-      </w:r>
-    </w:p>
-    <w:p>
-      <w:pPr>
-        <w:pStyle w:val="Heading2"/>
-      </w:pPr>
-      <w:r>
-        <w:t xml:space="preserve">7.2 GitHub Actions workflow</w:t>
+        <w:t xml:space="preserve">The FastAPI service (api/app.py) loads the pipeline once at start-up and exposes:</w:t>
       </w:r>
     </w:p>
     <w:tbl>
@@ -3919,9 +4517,8 @@
         </w:tblBorders>
       </w:tblPr>
       <w:tblGrid>
-        <w:gridCol w:w="1100"/>
-        <w:gridCol w:w="5300"/>
-        <w:gridCol w:w="2626"/>
+        <w:gridCol w:w="2200"/>
+        <w:gridCol w:w="6826"/>
       </w:tblGrid>
       <w:tr>
         <w:trPr>
@@ -3929,7 +4526,7 @@
         </w:trPr>
         <w:tc>
           <w:tcPr>
-            <w:tcW w:type="dxa" w:w="1100"/>
+            <w:tcW w:type="dxa" w:w="2200"/>
             <w:tcBorders>
               <w:top w:val="single" w:color="BFC5CC" w:sz="4"/>
               <w:left w:val="single" w:color="BFC5CC" w:sz="4"/>
@@ -3953,13 +4550,13 @@
                 <w:sz w:val="19"/>
                 <w:szCs w:val="19"/>
               </w:rPr>
-              <w:t xml:space="preserve">Job</w:t>
-            </w:r>
-          </w:p>
-        </w:tc>
-        <w:tc>
-          <w:tcPr>
-            <w:tcW w:type="dxa" w:w="5300"/>
+              <w:t xml:space="preserve">Endpoint</w:t>
+            </w:r>
+          </w:p>
+        </w:tc>
+        <w:tc>
+          <w:tcPr>
+            <w:tcW w:type="dxa" w:w="6826"/>
             <w:tcBorders>
               <w:top w:val="single" w:color="BFC5CC" w:sz="4"/>
               <w:left w:val="single" w:color="BFC5CC" w:sz="4"/>
@@ -3983,37 +4580,7 @@
                 <w:sz w:val="19"/>
                 <w:szCs w:val="19"/>
               </w:rPr>
-              <w:t xml:space="preserve">Steps</w:t>
-            </w:r>
-          </w:p>
-        </w:tc>
-        <w:tc>
-          <w:tcPr>
-            <w:tcW w:type="dxa" w:w="2626"/>
-            <w:tcBorders>
-              <w:top w:val="single" w:color="BFC5CC" w:sz="4"/>
-              <w:left w:val="single" w:color="BFC5CC" w:sz="4"/>
-              <w:bottom w:val="single" w:color="BFC5CC" w:sz="4"/>
-              <w:right w:val="single" w:color="BFC5CC" w:sz="4"/>
-            </w:tcBorders>
-            <w:shd w:fill="1F3B5C" w:val="clear"/>
-            <w:tcMar>
-              <w:top w:type="dxa" w:w="60"/>
-              <w:left w:type="dxa" w:w="100"/>
-              <w:bottom w:type="dxa" w:w="60"/>
-              <w:right w:type="dxa" w:w="100"/>
-            </w:tcMar>
-          </w:tcPr>
-          <w:p>
-            <w:r>
-              <w:rPr>
-                <w:b/>
-                <w:bCs/>
-                <w:color w:val="FFFFFF"/>
-                <w:sz w:val="19"/>
-                <w:szCs w:val="19"/>
-              </w:rPr>
-              <w:t xml:space="preserve">Fails when</w:t>
+              <w:t xml:space="preserve">Description</w:t>
             </w:r>
           </w:p>
         </w:tc>
@@ -4024,85 +4591,57 @@
         </w:trPr>
         <w:tc>
           <w:tcPr>
-            <w:tcW w:type="dxa" w:w="1100"/>
-            <w:tcBorders>
-              <w:top w:val="single" w:color="BFC5CC" w:sz="4"/>
-              <w:left w:val="single" w:color="BFC5CC" w:sz="4"/>
-              <w:bottom w:val="single" w:color="BFC5CC" w:sz="4"/>
-              <w:right w:val="single" w:color="BFC5CC" w:sz="4"/>
-            </w:tcBorders>
-            <w:tcMar>
-              <w:top w:type="dxa" w:w="60"/>
-              <w:left w:type="dxa" w:w="100"/>
-              <w:bottom w:type="dxa" w:w="60"/>
-              <w:right w:type="dxa" w:w="100"/>
-            </w:tcMar>
-          </w:tcPr>
-          <w:p>
-            <w:r>
-              <w:rPr>
-                <w:b w:val="false"/>
-                <w:bCs w:val="false"/>
-                <w:sz w:val="19"/>
-                <w:szCs w:val="19"/>
-              </w:rPr>
-              <w:t xml:space="preserve">lint</w:t>
-            </w:r>
-          </w:p>
-        </w:tc>
-        <w:tc>
-          <w:tcPr>
-            <w:tcW w:type="dxa" w:w="5300"/>
-            <w:tcBorders>
-              <w:top w:val="single" w:color="BFC5CC" w:sz="4"/>
-              <w:left w:val="single" w:color="BFC5CC" w:sz="4"/>
-              <w:bottom w:val="single" w:color="BFC5CC" w:sz="4"/>
-              <w:right w:val="single" w:color="BFC5CC" w:sz="4"/>
-            </w:tcBorders>
-            <w:tcMar>
-              <w:top w:type="dxa" w:w="60"/>
-              <w:left w:type="dxa" w:w="100"/>
-              <w:bottom w:type="dxa" w:w="60"/>
-              <w:right w:type="dxa" w:w="100"/>
-            </w:tcMar>
-          </w:tcPr>
-          <w:p>
-            <w:r>
-              <w:rPr>
-                <w:b w:val="false"/>
-                <w:bCs w:val="false"/>
-                <w:sz w:val="19"/>
-                <w:szCs w:val="19"/>
-              </w:rPr>
-              <w:t xml:space="preserve">flake8 (max line 120)</w:t>
-            </w:r>
-          </w:p>
-        </w:tc>
-        <w:tc>
-          <w:tcPr>
-            <w:tcW w:type="dxa" w:w="2626"/>
-            <w:tcBorders>
-              <w:top w:val="single" w:color="BFC5CC" w:sz="4"/>
-              <w:left w:val="single" w:color="BFC5CC" w:sz="4"/>
-              <w:bottom w:val="single" w:color="BFC5CC" w:sz="4"/>
-              <w:right w:val="single" w:color="BFC5CC" w:sz="4"/>
-            </w:tcBorders>
-            <w:tcMar>
-              <w:top w:type="dxa" w:w="60"/>
-              <w:left w:type="dxa" w:w="100"/>
-              <w:bottom w:type="dxa" w:w="60"/>
-              <w:right w:type="dxa" w:w="100"/>
-            </w:tcMar>
-          </w:tcPr>
-          <w:p>
-            <w:r>
-              <w:rPr>
-                <w:b w:val="false"/>
-                <w:bCs w:val="false"/>
-                <w:sz w:val="19"/>
-                <w:szCs w:val="19"/>
-              </w:rPr>
-              <w:t xml:space="preserve">any style or syntax error</w:t>
+            <w:tcW w:type="dxa" w:w="2200"/>
+            <w:tcBorders>
+              <w:top w:val="single" w:color="BFC5CC" w:sz="4"/>
+              <w:left w:val="single" w:color="BFC5CC" w:sz="4"/>
+              <w:bottom w:val="single" w:color="BFC5CC" w:sz="4"/>
+              <w:right w:val="single" w:color="BFC5CC" w:sz="4"/>
+            </w:tcBorders>
+            <w:tcMar>
+              <w:top w:type="dxa" w:w="60"/>
+              <w:left w:type="dxa" w:w="100"/>
+              <w:bottom w:type="dxa" w:w="60"/>
+              <w:right w:type="dxa" w:w="100"/>
+            </w:tcMar>
+          </w:tcPr>
+          <w:p>
+            <w:r>
+              <w:rPr>
+                <w:b w:val="false"/>
+                <w:bCs w:val="false"/>
+                <w:sz w:val="19"/>
+                <w:szCs w:val="19"/>
+              </w:rPr>
+              <w:t xml:space="preserve">POST /predict</w:t>
+            </w:r>
+          </w:p>
+        </w:tc>
+        <w:tc>
+          <w:tcPr>
+            <w:tcW w:type="dxa" w:w="6826"/>
+            <w:tcBorders>
+              <w:top w:val="single" w:color="BFC5CC" w:sz="4"/>
+              <w:left w:val="single" w:color="BFC5CC" w:sz="4"/>
+              <w:bottom w:val="single" w:color="BFC5CC" w:sz="4"/>
+              <w:right w:val="single" w:color="BFC5CC" w:sz="4"/>
+            </w:tcBorders>
+            <w:tcMar>
+              <w:top w:type="dxa" w:w="60"/>
+              <w:left w:type="dxa" w:w="100"/>
+              <w:bottom w:type="dxa" w:w="60"/>
+              <w:right w:type="dxa" w:w="100"/>
+            </w:tcMar>
+          </w:tcPr>
+          <w:p>
+            <w:r>
+              <w:rPr>
+                <w:b w:val="false"/>
+                <w:bCs w:val="false"/>
+                <w:sz w:val="19"/>
+                <w:szCs w:val="19"/>
+              </w:rPr>
+              <w:t xml:space="preserve">One patient (JSON) → prediction, label, risk_probability, confidence, model name/version, request id</w:t>
             </w:r>
           </w:p>
         </w:tc>
@@ -4113,7 +4652,7 @@
         </w:trPr>
         <w:tc>
           <w:tcPr>
-            <w:tcW w:type="dxa" w:w="1100"/>
+            <w:tcW w:type="dxa" w:w="2200"/>
             <w:tcBorders>
               <w:top w:val="single" w:color="BFC5CC" w:sz="4"/>
               <w:left w:val="single" w:color="BFC5CC" w:sz="4"/>
@@ -4136,13 +4675,13 @@
                 <w:sz w:val="19"/>
                 <w:szCs w:val="19"/>
               </w:rPr>
-              <w:t xml:space="preserve">test</w:t>
-            </w:r>
-          </w:p>
-        </w:tc>
-        <w:tc>
-          <w:tcPr>
-            <w:tcW w:type="dxa" w:w="5300"/>
+              <w:t xml:space="preserve">POST /predict/batch</w:t>
+            </w:r>
+          </w:p>
+        </w:tc>
+        <w:tc>
+          <w:tcPr>
+            <w:tcW w:type="dxa" w:w="6826"/>
             <w:tcBorders>
               <w:top w:val="single" w:color="BFC5CC" w:sz="4"/>
               <w:left w:val="single" w:color="BFC5CC" w:sz="4"/>
@@ -4165,36 +4704,7 @@
                 <w:sz w:val="19"/>
                 <w:szCs w:val="19"/>
               </w:rPr>
-              <w:t xml:space="preserve">pytest with coverage; JUnit and coverage XML uploaded as artifacts</w:t>
-            </w:r>
-          </w:p>
-        </w:tc>
-        <w:tc>
-          <w:tcPr>
-            <w:tcW w:type="dxa" w:w="2626"/>
-            <w:tcBorders>
-              <w:top w:val="single" w:color="BFC5CC" w:sz="4"/>
-              <w:left w:val="single" w:color="BFC5CC" w:sz="4"/>
-              <w:bottom w:val="single" w:color="BFC5CC" w:sz="4"/>
-              <w:right w:val="single" w:color="BFC5CC" w:sz="4"/>
-            </w:tcBorders>
-            <w:shd w:fill="F5F7FA" w:val="clear"/>
-            <w:tcMar>
-              <w:top w:type="dxa" w:w="60"/>
-              <w:left w:type="dxa" w:w="100"/>
-              <w:bottom w:type="dxa" w:w="60"/>
-              <w:right w:type="dxa" w:w="100"/>
-            </w:tcMar>
-          </w:tcPr>
-          <w:p>
-            <w:r>
-              <w:rPr>
-                <w:b w:val="false"/>
-                <w:bCs w:val="false"/>
-                <w:sz w:val="19"/>
-                <w:szCs w:val="19"/>
-              </w:rPr>
-              <w:t xml:space="preserve">any test fails</w:t>
+              <w:t xml:space="preserve">Up to 500 patients</w:t>
             </w:r>
           </w:p>
         </w:tc>
@@ -4205,85 +4715,57 @@
         </w:trPr>
         <w:tc>
           <w:tcPr>
-            <w:tcW w:type="dxa" w:w="1100"/>
-            <w:tcBorders>
-              <w:top w:val="single" w:color="BFC5CC" w:sz="4"/>
-              <w:left w:val="single" w:color="BFC5CC" w:sz="4"/>
-              <w:bottom w:val="single" w:color="BFC5CC" w:sz="4"/>
-              <w:right w:val="single" w:color="BFC5CC" w:sz="4"/>
-            </w:tcBorders>
-            <w:tcMar>
-              <w:top w:type="dxa" w:w="60"/>
-              <w:left w:type="dxa" w:w="100"/>
-              <w:bottom w:type="dxa" w:w="60"/>
-              <w:right w:type="dxa" w:w="100"/>
-            </w:tcMar>
-          </w:tcPr>
-          <w:p>
-            <w:r>
-              <w:rPr>
-                <w:b w:val="false"/>
-                <w:bCs w:val="false"/>
-                <w:sz w:val="19"/>
-                <w:szCs w:val="19"/>
-              </w:rPr>
-              <w:t xml:space="preserve">train</w:t>
-            </w:r>
-          </w:p>
-        </w:tc>
-        <w:tc>
-          <w:tcPr>
-            <w:tcW w:type="dxa" w:w="5300"/>
-            <w:tcBorders>
-              <w:top w:val="single" w:color="BFC5CC" w:sz="4"/>
-              <w:left w:val="single" w:color="BFC5CC" w:sz="4"/>
-              <w:bottom w:val="single" w:color="BFC5CC" w:sz="4"/>
-              <w:right w:val="single" w:color="BFC5CC" w:sz="4"/>
-            </w:tcBorders>
-            <w:tcMar>
-              <w:top w:type="dxa" w:w="60"/>
-              <w:left w:type="dxa" w:w="100"/>
-              <w:bottom w:type="dxa" w:w="60"/>
-              <w:right w:type="dxa" w:w="100"/>
-            </w:tcMar>
-          </w:tcPr>
-          <w:p>
-            <w:r>
-              <w:rPr>
-                <w:b w:val="false"/>
-                <w:bCs w:val="false"/>
-                <w:sz w:val="19"/>
-                <w:szCs w:val="19"/>
-              </w:rPr>
-              <w:t xml:space="preserve">download data → EDA → train with MLflow → quality gate; model, MLflow DB and figures uploaded</w:t>
-            </w:r>
-          </w:p>
-        </w:tc>
-        <w:tc>
-          <w:tcPr>
-            <w:tcW w:type="dxa" w:w="2626"/>
-            <w:tcBorders>
-              <w:top w:val="single" w:color="BFC5CC" w:sz="4"/>
-              <w:left w:val="single" w:color="BFC5CC" w:sz="4"/>
-              <w:bottom w:val="single" w:color="BFC5CC" w:sz="4"/>
-              <w:right w:val="single" w:color="BFC5CC" w:sz="4"/>
-            </w:tcBorders>
-            <w:tcMar>
-              <w:top w:type="dxa" w:w="60"/>
-              <w:left w:type="dxa" w:w="100"/>
-              <w:bottom w:type="dxa" w:w="60"/>
-              <w:right w:type="dxa" w:w="100"/>
-            </w:tcMar>
-          </w:tcPr>
-          <w:p>
-            <w:r>
-              <w:rPr>
-                <w:b w:val="false"/>
-                <w:bCs w:val="false"/>
-                <w:sz w:val="19"/>
-                <w:szCs w:val="19"/>
-              </w:rPr>
-              <w:t xml:space="preserve">training error or ROC-AUC &lt; 0.80</w:t>
+            <w:tcW w:type="dxa" w:w="2200"/>
+            <w:tcBorders>
+              <w:top w:val="single" w:color="BFC5CC" w:sz="4"/>
+              <w:left w:val="single" w:color="BFC5CC" w:sz="4"/>
+              <w:bottom w:val="single" w:color="BFC5CC" w:sz="4"/>
+              <w:right w:val="single" w:color="BFC5CC" w:sz="4"/>
+            </w:tcBorders>
+            <w:tcMar>
+              <w:top w:type="dxa" w:w="60"/>
+              <w:left w:type="dxa" w:w="100"/>
+              <w:bottom w:type="dxa" w:w="60"/>
+              <w:right w:type="dxa" w:w="100"/>
+            </w:tcMar>
+          </w:tcPr>
+          <w:p>
+            <w:r>
+              <w:rPr>
+                <w:b w:val="false"/>
+                <w:bCs w:val="false"/>
+                <w:sz w:val="19"/>
+                <w:szCs w:val="19"/>
+              </w:rPr>
+              <w:t xml:space="preserve">GET /health</w:t>
+            </w:r>
+          </w:p>
+        </w:tc>
+        <w:tc>
+          <w:tcPr>
+            <w:tcW w:type="dxa" w:w="6826"/>
+            <w:tcBorders>
+              <w:top w:val="single" w:color="BFC5CC" w:sz="4"/>
+              <w:left w:val="single" w:color="BFC5CC" w:sz="4"/>
+              <w:bottom w:val="single" w:color="BFC5CC" w:sz="4"/>
+              <w:right w:val="single" w:color="BFC5CC" w:sz="4"/>
+            </w:tcBorders>
+            <w:tcMar>
+              <w:top w:type="dxa" w:w="60"/>
+              <w:left w:type="dxa" w:w="100"/>
+              <w:bottom w:type="dxa" w:w="60"/>
+              <w:right w:type="dxa" w:w="100"/>
+            </w:tcMar>
+          </w:tcPr>
+          <w:p>
+            <w:r>
+              <w:rPr>
+                <w:b w:val="false"/>
+                <w:bCs w:val="false"/>
+                <w:sz w:val="19"/>
+                <w:szCs w:val="19"/>
+              </w:rPr>
+              <w:t xml:space="preserve">Liveness and readiness check; returns 503 if the model is not loaded</w:t>
             </w:r>
           </w:p>
         </w:tc>
@@ -4294,7 +4776,7 @@
         </w:trPr>
         <w:tc>
           <w:tcPr>
-            <w:tcW w:type="dxa" w:w="1100"/>
+            <w:tcW w:type="dxa" w:w="2200"/>
             <w:tcBorders>
               <w:top w:val="single" w:color="BFC5CC" w:sz="4"/>
               <w:left w:val="single" w:color="BFC5CC" w:sz="4"/>
@@ -4317,13 +4799,13 @@
                 <w:sz w:val="19"/>
                 <w:szCs w:val="19"/>
               </w:rPr>
-              <w:t xml:space="preserve">docker</w:t>
-            </w:r>
-          </w:p>
-        </w:tc>
-        <w:tc>
-          <w:tcPr>
-            <w:tcW w:type="dxa" w:w="5300"/>
+              <w:t xml:space="preserve">GET /metrics</w:t>
+            </w:r>
+          </w:p>
+        </w:tc>
+        <w:tc>
+          <w:tcPr>
+            <w:tcW w:type="dxa" w:w="6826"/>
             <w:tcBorders>
               <w:top w:val="single" w:color="BFC5CC" w:sz="4"/>
               <w:left w:val="single" w:color="BFC5CC" w:sz="4"/>
@@ -4346,36 +4828,68 @@
                 <w:sz w:val="19"/>
                 <w:szCs w:val="19"/>
               </w:rPr>
-              <w:t xml:space="preserve">build image with the CI-trained model, run it, curl /health and /predict, print logs; push to GHCR on main</w:t>
-            </w:r>
-          </w:p>
-        </w:tc>
-        <w:tc>
-          <w:tcPr>
-            <w:tcW w:type="dxa" w:w="2626"/>
-            <w:tcBorders>
-              <w:top w:val="single" w:color="BFC5CC" w:sz="4"/>
-              <w:left w:val="single" w:color="BFC5CC" w:sz="4"/>
-              <w:bottom w:val="single" w:color="BFC5CC" w:sz="4"/>
-              <w:right w:val="single" w:color="BFC5CC" w:sz="4"/>
-            </w:tcBorders>
-            <w:shd w:fill="F5F7FA" w:val="clear"/>
-            <w:tcMar>
-              <w:top w:type="dxa" w:w="60"/>
-              <w:left w:type="dxa" w:w="100"/>
-              <w:bottom w:type="dxa" w:w="60"/>
-              <w:right w:type="dxa" w:w="100"/>
-            </w:tcMar>
-          </w:tcPr>
-          <w:p>
-            <w:r>
-              <w:rPr>
-                <w:b w:val="false"/>
-                <w:bCs w:val="false"/>
-                <w:sz w:val="19"/>
-                <w:szCs w:val="19"/>
-              </w:rPr>
-              <w:t xml:space="preserve">build error or failed smoke test</w:t>
+              <w:t xml:space="preserve">Prometheus exposition format</w:t>
+            </w:r>
+          </w:p>
+        </w:tc>
+      </w:tr>
+      <w:tr>
+        <w:trPr>
+          <w:tblHeader w:val="false"/>
+        </w:trPr>
+        <w:tc>
+          <w:tcPr>
+            <w:tcW w:type="dxa" w:w="2200"/>
+            <w:tcBorders>
+              <w:top w:val="single" w:color="BFC5CC" w:sz="4"/>
+              <w:left w:val="single" w:color="BFC5CC" w:sz="4"/>
+              <w:bottom w:val="single" w:color="BFC5CC" w:sz="4"/>
+              <w:right w:val="single" w:color="BFC5CC" w:sz="4"/>
+            </w:tcBorders>
+            <w:tcMar>
+              <w:top w:type="dxa" w:w="60"/>
+              <w:left w:type="dxa" w:w="100"/>
+              <w:bottom w:type="dxa" w:w="60"/>
+              <w:right w:type="dxa" w:w="100"/>
+            </w:tcMar>
+          </w:tcPr>
+          <w:p>
+            <w:r>
+              <w:rPr>
+                <w:b w:val="false"/>
+                <w:bCs w:val="false"/>
+                <w:sz w:val="19"/>
+                <w:szCs w:val="19"/>
+              </w:rPr>
+              <w:t xml:space="preserve">GET /docs</w:t>
+            </w:r>
+          </w:p>
+        </w:tc>
+        <w:tc>
+          <w:tcPr>
+            <w:tcW w:type="dxa" w:w="6826"/>
+            <w:tcBorders>
+              <w:top w:val="single" w:color="BFC5CC" w:sz="4"/>
+              <w:left w:val="single" w:color="BFC5CC" w:sz="4"/>
+              <w:bottom w:val="single" w:color="BFC5CC" w:sz="4"/>
+              <w:right w:val="single" w:color="BFC5CC" w:sz="4"/>
+            </w:tcBorders>
+            <w:tcMar>
+              <w:top w:type="dxa" w:w="60"/>
+              <w:left w:type="dxa" w:w="100"/>
+              <w:bottom w:type="dxa" w:w="60"/>
+              <w:right w:type="dxa" w:w="100"/>
+            </w:tcMar>
+          </w:tcPr>
+          <w:p>
+            <w:r>
+              <w:rPr>
+                <w:b w:val="false"/>
+                <w:bCs w:val="false"/>
+                <w:sz w:val="19"/>
+                <w:szCs w:val="19"/>
+              </w:rPr>
+              <w:t xml:space="preserve">Interactive Swagger UI</w:t>
             </w:r>
           </w:p>
         </w:tc>
@@ -4391,7 +4905,133 @@
         <w:spacing w:after="120" w:line="276"/>
       </w:pPr>
       <w:r>
-        <w:t xml:space="preserve">The jobs are chained with needs:, so a failure stops the pipeline early, and each step's output is visible in the Actions log.</w:t>
+        <w:t xml:space="preserve">Input is validated by a Pydantic schema with types, ranges and allowed codes taken from the UCI data dictionary. ca and thal may be null and are imputed by the pipeline. Confidence is the probability of the predicted class.</w:t>
+      </w:r>
+    </w:p>
+    <w:p>
+      <w:pPr>
+        <w:spacing w:after="120" w:line="276"/>
+      </w:pPr>
+      <w:r>
+        <w:t xml:space="preserve">The Dockerfile uses python:3.12-slim, installs dependencies in a separate layer for caching, runs as a non-root user, and defines a HEALTHCHECK. It runs a single uvicorn worker because Prometheus metrics are kept in-process; scaling is done with replicas.</w:t>
+      </w:r>
+    </w:p>
+    <w:p>
+      <w:pPr>
+        <w:shd w:fill="F3F4F6" w:val="clear"/>
+        <w:spacing w:after="0"/>
+        <w:ind w:left="200"/>
+      </w:pPr>
+      <w:r>
+        <w:rPr>
+          <w:rFonts w:ascii="Consolas" w:cs="Consolas" w:eastAsia="Consolas" w:hAnsi="Consolas"/>
+          <w:sz w:val="17"/>
+          <w:szCs w:val="17"/>
+        </w:rPr>
+        <w:t xml:space="preserve">&gt; curl -X POST localhost:8000/predict -H "Content-Type: application/json" -d @sample_request.json</w:t>
+      </w:r>
+    </w:p>
+    <w:p>
+      <w:pPr>
+        <w:shd w:fill="F3F4F6" w:val="clear"/>
+        <w:spacing w:after="0"/>
+        <w:ind w:left="200"/>
+      </w:pPr>
+      <w:r>
+        <w:rPr>
+          <w:rFonts w:ascii="Consolas" w:cs="Consolas" w:eastAsia="Consolas" w:hAnsi="Consolas"/>
+          <w:sz w:val="17"/>
+          <w:szCs w:val="17"/>
+        </w:rPr>
+        <w:t xml:space="preserve">{"prediction":1,"label":"disease","risk_probability":0.9947,"confidence":0.9947,</w:t>
+      </w:r>
+    </w:p>
+    <w:p>
+      <w:pPr>
+        <w:shd w:fill="F3F4F6" w:val="clear"/>
+        <w:spacing w:after="0"/>
+        <w:ind w:left="200"/>
+      </w:pPr>
+      <w:r>
+        <w:rPr>
+          <w:rFonts w:ascii="Consolas" w:cs="Consolas" w:eastAsia="Consolas" w:hAnsi="Consolas"/>
+          <w:sz w:val="17"/>
+          <w:szCs w:val="17"/>
+        </w:rPr>
+        <w:t xml:space="preserve"> "model_name":"logistic_regression","model_version":"2026-10-19T14:34:39+00:00","request_id":"05e39e3267e2"}</w:t>
+      </w:r>
+    </w:p>
+    <w:p>
+      <w:pPr>
+        <w:spacing w:after="120"/>
+      </w:pPr>
+    </w:p>
+    <w:p>
+      <w:pPr>
+        <w:pStyle w:val="Heading1"/>
+      </w:pPr>
+      <w:r>
+        <w:t xml:space="preserve">9. Production Deployment</w:t>
+      </w:r>
+    </w:p>
+    <w:p>
+      <w:pPr>
+        <w:spacing w:after="120" w:line="276"/>
+      </w:pPr>
+      <w:r>
+        <w:t xml:space="preserve">The image is deployed to the Kubernetes cluster built into Docker Desktop (v1.36). The k8s/ directory contains:</w:t>
+      </w:r>
+    </w:p>
+    <w:p>
+      <w:pPr>
+        <w:pStyle w:val="ListParagraph"/>
+        <w:numPr>
+          <w:ilvl w:val="0"/>
+          <w:numId w:val="2"/>
+        </w:numPr>
+        <w:spacing w:after="60"/>
+      </w:pPr>
+      <w:r>
+        <w:t xml:space="preserve">deployment.yaml: 2 replicas, a RollingUpdate strategy with maxUnavailable 0, CPU and memory requests and limits, readiness and liveness probes on /health, and prometheus.io annotations.</w:t>
+      </w:r>
+    </w:p>
+    <w:p>
+      <w:pPr>
+        <w:pStyle w:val="ListParagraph"/>
+        <w:numPr>
+          <w:ilvl w:val="0"/>
+          <w:numId w:val="2"/>
+        </w:numPr>
+        <w:spacing w:after="60"/>
+      </w:pPr>
+      <w:r>
+        <w:t xml:space="preserve">service.yaml: a LoadBalancer on port 8080 → 8000. Docker Desktop exposes it on localhost; on GKE, EKS or AKS a cloud load balancer IP is assigned.</w:t>
+      </w:r>
+    </w:p>
+    <w:p>
+      <w:pPr>
+        <w:pStyle w:val="ListParagraph"/>
+        <w:numPr>
+          <w:ilvl w:val="0"/>
+          <w:numId w:val="2"/>
+        </w:numPr>
+        <w:spacing w:after="60"/>
+      </w:pPr>
+      <w:r>
+        <w:t xml:space="preserve">ingress.yaml: optional nginx ingress for host heart.local.</w:t>
+      </w:r>
+    </w:p>
+    <w:p>
+      <w:pPr>
+        <w:pStyle w:val="ListParagraph"/>
+        <w:numPr>
+          <w:ilvl w:val="0"/>
+          <w:numId w:val="2"/>
+        </w:numPr>
+        <w:spacing w:after="60"/>
+      </w:pPr>
+      <w:r>
+        <w:t xml:space="preserve">monitoring.yaml: an in-cluster Prometheus with RBAC that discovers the API pods through their annotations.</w:t>
       </w:r>
     </w:p>
     <w:p>
@@ -4402,9 +5042,9 @@
       <w:r>
         <w:drawing>
           <wp:inline distT="0" distB="0" distL="0" distR="0">
-            <wp:extent cx="5715000" cy="2647950"/>
+            <wp:extent cx="5143500" cy="1857375"/>
             <wp:effectExtent t="0" r="0" b="0" l="0"/>
-            <wp:docPr id="1" name="ci_success.jpg" descr="Figure 10. Successful GitHub Actions run" title="Figure 10. Successful GitHub Actions run"/>
+            <wp:docPr id="1" name="k8s_pods.png" descr="Figure 10. Kubernetes deployment, pods and LoadBalancer service" title="Figure 10. Kubernetes deployment, pods and LoadBalancer service"/>
             <wp:cNvGraphicFramePr>
               <a:graphicFrameLocks xmlns:a="http://schemas.openxmlformats.org/drawingml/2006/main" noChangeAspect="1"/>
             </wp:cNvGraphicFramePr>
@@ -4427,7 +5067,7 @@
                   <pic:spPr bwMode="auto">
                     <a:xfrm>
                       <a:off x="0" y="0"/>
-                      <a:ext cx="5715000" cy="2647950"/>
+                      <a:ext cx="5143500" cy="1857375"/>
                     </a:xfrm>
                     <a:prstGeom prst="rect">
                       <a:avLst/>
@@ -4453,7 +5093,7 @@
           <w:sz w:val="18"/>
           <w:szCs w:val="18"/>
         </w:rPr>
-        <w:t xml:space="preserve">Figure 10. Successful GitHub Actions run</w:t>
+        <w:t xml:space="preserve">Figure 10. Kubernetes deployment, pods and LoadBalancer service</w:t>
       </w:r>
     </w:p>
     <w:p>
@@ -4461,478 +5101,67 @@
         <w:pStyle w:val="Heading1"/>
       </w:pPr>
       <w:r>
-        <w:t xml:space="preserve">8. Model Containerisation</w:t>
-      </w:r>
-    </w:p>
-    <w:p>
-      <w:pPr>
-        <w:spacing w:after="120" w:line="276"/>
-      </w:pPr>
-      <w:r>
-        <w:t xml:space="preserve">The FastAPI service (api/app.py) loads the pipeline once at start-up and exposes:</w:t>
-      </w:r>
-    </w:p>
-    <w:tbl>
-      <w:tblPr>
-        <w:tblW w:type="dxa" w:w="9026"/>
-        <w:tblBorders>
-          <w:top w:val="single" w:color="auto" w:sz="4"/>
-          <w:left w:val="single" w:color="auto" w:sz="4"/>
-          <w:bottom w:val="single" w:color="auto" w:sz="4"/>
-          <w:right w:val="single" w:color="auto" w:sz="4"/>
-          <w:insideH w:val="single" w:color="auto" w:sz="4"/>
-          <w:insideV w:val="single" w:color="auto" w:sz="4"/>
-        </w:tblBorders>
-      </w:tblPr>
-      <w:tblGrid>
-        <w:gridCol w:w="2200"/>
-        <w:gridCol w:w="6826"/>
-      </w:tblGrid>
-      <w:tr>
-        <w:trPr>
-          <w:tblHeader/>
-        </w:trPr>
-        <w:tc>
-          <w:tcPr>
-            <w:tcW w:type="dxa" w:w="2200"/>
-            <w:tcBorders>
-              <w:top w:val="single" w:color="BFC5CC" w:sz="4"/>
-              <w:left w:val="single" w:color="BFC5CC" w:sz="4"/>
-              <w:bottom w:val="single" w:color="BFC5CC" w:sz="4"/>
-              <w:right w:val="single" w:color="BFC5CC" w:sz="4"/>
-            </w:tcBorders>
-            <w:shd w:fill="1F3B5C" w:val="clear"/>
-            <w:tcMar>
-              <w:top w:type="dxa" w:w="60"/>
-              <w:left w:type="dxa" w:w="100"/>
-              <w:bottom w:type="dxa" w:w="60"/>
-              <w:right w:type="dxa" w:w="100"/>
-            </w:tcMar>
-          </w:tcPr>
-          <w:p>
-            <w:r>
-              <w:rPr>
-                <w:b/>
-                <w:bCs/>
-                <w:color w:val="FFFFFF"/>
-                <w:sz w:val="19"/>
-                <w:szCs w:val="19"/>
-              </w:rPr>
-              <w:t xml:space="preserve">Endpoint</w:t>
-            </w:r>
-          </w:p>
-        </w:tc>
-        <w:tc>
-          <w:tcPr>
-            <w:tcW w:type="dxa" w:w="6826"/>
-            <w:tcBorders>
-              <w:top w:val="single" w:color="BFC5CC" w:sz="4"/>
-              <w:left w:val="single" w:color="BFC5CC" w:sz="4"/>
-              <w:bottom w:val="single" w:color="BFC5CC" w:sz="4"/>
-              <w:right w:val="single" w:color="BFC5CC" w:sz="4"/>
-            </w:tcBorders>
-            <w:shd w:fill="1F3B5C" w:val="clear"/>
-            <w:tcMar>
-              <w:top w:type="dxa" w:w="60"/>
-              <w:left w:type="dxa" w:w="100"/>
-              <w:bottom w:type="dxa" w:w="60"/>
-              <w:right w:type="dxa" w:w="100"/>
-            </w:tcMar>
-          </w:tcPr>
-          <w:p>
-            <w:r>
-              <w:rPr>
-                <w:b/>
-                <w:bCs/>
-                <w:color w:val="FFFFFF"/>
-                <w:sz w:val="19"/>
-                <w:szCs w:val="19"/>
-              </w:rPr>
-              <w:t xml:space="preserve">Description</w:t>
-            </w:r>
-          </w:p>
-        </w:tc>
-      </w:tr>
-      <w:tr>
-        <w:trPr>
-          <w:tblHeader w:val="false"/>
-        </w:trPr>
-        <w:tc>
-          <w:tcPr>
-            <w:tcW w:type="dxa" w:w="2200"/>
-            <w:tcBorders>
-              <w:top w:val="single" w:color="BFC5CC" w:sz="4"/>
-              <w:left w:val="single" w:color="BFC5CC" w:sz="4"/>
-              <w:bottom w:val="single" w:color="BFC5CC" w:sz="4"/>
-              <w:right w:val="single" w:color="BFC5CC" w:sz="4"/>
-            </w:tcBorders>
-            <w:tcMar>
-              <w:top w:type="dxa" w:w="60"/>
-              <w:left w:type="dxa" w:w="100"/>
-              <w:bottom w:type="dxa" w:w="60"/>
-              <w:right w:type="dxa" w:w="100"/>
-            </w:tcMar>
-          </w:tcPr>
-          <w:p>
-            <w:r>
-              <w:rPr>
-                <w:b w:val="false"/>
-                <w:bCs w:val="false"/>
-                <w:sz w:val="19"/>
-                <w:szCs w:val="19"/>
-              </w:rPr>
-              <w:t xml:space="preserve">POST /predict</w:t>
-            </w:r>
-          </w:p>
-        </w:tc>
-        <w:tc>
-          <w:tcPr>
-            <w:tcW w:type="dxa" w:w="6826"/>
-            <w:tcBorders>
-              <w:top w:val="single" w:color="BFC5CC" w:sz="4"/>
-              <w:left w:val="single" w:color="BFC5CC" w:sz="4"/>
-              <w:bottom w:val="single" w:color="BFC5CC" w:sz="4"/>
-              <w:right w:val="single" w:color="BFC5CC" w:sz="4"/>
-            </w:tcBorders>
-            <w:tcMar>
-              <w:top w:type="dxa" w:w="60"/>
-              <w:left w:type="dxa" w:w="100"/>
-              <w:bottom w:type="dxa" w:w="60"/>
-              <w:right w:type="dxa" w:w="100"/>
-            </w:tcMar>
-          </w:tcPr>
-          <w:p>
-            <w:r>
-              <w:rPr>
-                <w:b w:val="false"/>
-                <w:bCs w:val="false"/>
-                <w:sz w:val="19"/>
-                <w:szCs w:val="19"/>
-              </w:rPr>
-              <w:t xml:space="preserve">One patient (JSON) → prediction, label, risk_probability, confidence, model name/version, request id</w:t>
-            </w:r>
-          </w:p>
-        </w:tc>
-      </w:tr>
-      <w:tr>
-        <w:trPr>
-          <w:tblHeader w:val="false"/>
-        </w:trPr>
-        <w:tc>
-          <w:tcPr>
-            <w:tcW w:type="dxa" w:w="2200"/>
-            <w:tcBorders>
-              <w:top w:val="single" w:color="BFC5CC" w:sz="4"/>
-              <w:left w:val="single" w:color="BFC5CC" w:sz="4"/>
-              <w:bottom w:val="single" w:color="BFC5CC" w:sz="4"/>
-              <w:right w:val="single" w:color="BFC5CC" w:sz="4"/>
-            </w:tcBorders>
-            <w:shd w:fill="F5F7FA" w:val="clear"/>
-            <w:tcMar>
-              <w:top w:type="dxa" w:w="60"/>
-              <w:left w:type="dxa" w:w="100"/>
-              <w:bottom w:type="dxa" w:w="60"/>
-              <w:right w:type="dxa" w:w="100"/>
-            </w:tcMar>
-          </w:tcPr>
-          <w:p>
-            <w:r>
-              <w:rPr>
-                <w:b w:val="false"/>
-                <w:bCs w:val="false"/>
-                <w:sz w:val="19"/>
-                <w:szCs w:val="19"/>
-              </w:rPr>
-              <w:t xml:space="preserve">POST /predict/batch</w:t>
-            </w:r>
-          </w:p>
-        </w:tc>
-        <w:tc>
-          <w:tcPr>
-            <w:tcW w:type="dxa" w:w="6826"/>
-            <w:tcBorders>
-              <w:top w:val="single" w:color="BFC5CC" w:sz="4"/>
-              <w:left w:val="single" w:color="BFC5CC" w:sz="4"/>
-              <w:bottom w:val="single" w:color="BFC5CC" w:sz="4"/>
-              <w:right w:val="single" w:color="BFC5CC" w:sz="4"/>
-            </w:tcBorders>
-            <w:shd w:fill="F5F7FA" w:val="clear"/>
-            <w:tcMar>
-              <w:top w:type="dxa" w:w="60"/>
-              <w:left w:type="dxa" w:w="100"/>
-              <w:bottom w:type="dxa" w:w="60"/>
-              <w:right w:type="dxa" w:w="100"/>
-            </w:tcMar>
-          </w:tcPr>
-          <w:p>
-            <w:r>
-              <w:rPr>
-                <w:b w:val="false"/>
-                <w:bCs w:val="false"/>
-                <w:sz w:val="19"/>
-                <w:szCs w:val="19"/>
-              </w:rPr>
-              <w:t xml:space="preserve">Up to 500 patients</w:t>
-            </w:r>
-          </w:p>
-        </w:tc>
-      </w:tr>
-      <w:tr>
-        <w:trPr>
-          <w:tblHeader w:val="false"/>
-        </w:trPr>
-        <w:tc>
-          <w:tcPr>
-            <w:tcW w:type="dxa" w:w="2200"/>
-            <w:tcBorders>
-              <w:top w:val="single" w:color="BFC5CC" w:sz="4"/>
-              <w:left w:val="single" w:color="BFC5CC" w:sz="4"/>
-              <w:bottom w:val="single" w:color="BFC5CC" w:sz="4"/>
-              <w:right w:val="single" w:color="BFC5CC" w:sz="4"/>
-            </w:tcBorders>
-            <w:tcMar>
-              <w:top w:type="dxa" w:w="60"/>
-              <w:left w:type="dxa" w:w="100"/>
-              <w:bottom w:type="dxa" w:w="60"/>
-              <w:right w:type="dxa" w:w="100"/>
-            </w:tcMar>
-          </w:tcPr>
-          <w:p>
-            <w:r>
-              <w:rPr>
-                <w:b w:val="false"/>
-                <w:bCs w:val="false"/>
-                <w:sz w:val="19"/>
-                <w:szCs w:val="19"/>
-              </w:rPr>
-              <w:t xml:space="preserve">GET /health</w:t>
-            </w:r>
-          </w:p>
-        </w:tc>
-        <w:tc>
-          <w:tcPr>
-            <w:tcW w:type="dxa" w:w="6826"/>
-            <w:tcBorders>
-              <w:top w:val="single" w:color="BFC5CC" w:sz="4"/>
-              <w:left w:val="single" w:color="BFC5CC" w:sz="4"/>
-              <w:bottom w:val="single" w:color="BFC5CC" w:sz="4"/>
-              <w:right w:val="single" w:color="BFC5CC" w:sz="4"/>
-            </w:tcBorders>
-            <w:tcMar>
-              <w:top w:type="dxa" w:w="60"/>
-              <w:left w:type="dxa" w:w="100"/>
-              <w:bottom w:type="dxa" w:w="60"/>
-              <w:right w:type="dxa" w:w="100"/>
-            </w:tcMar>
-          </w:tcPr>
-          <w:p>
-            <w:r>
-              <w:rPr>
-                <w:b w:val="false"/>
-                <w:bCs w:val="false"/>
-                <w:sz w:val="19"/>
-                <w:szCs w:val="19"/>
-              </w:rPr>
-              <w:t xml:space="preserve">Liveness and readiness check; returns 503 if the model is not loaded</w:t>
-            </w:r>
-          </w:p>
-        </w:tc>
-      </w:tr>
-      <w:tr>
-        <w:trPr>
-          <w:tblHeader w:val="false"/>
-        </w:trPr>
-        <w:tc>
-          <w:tcPr>
-            <w:tcW w:type="dxa" w:w="2200"/>
-            <w:tcBorders>
-              <w:top w:val="single" w:color="BFC5CC" w:sz="4"/>
-              <w:left w:val="single" w:color="BFC5CC" w:sz="4"/>
-              <w:bottom w:val="single" w:color="BFC5CC" w:sz="4"/>
-              <w:right w:val="single" w:color="BFC5CC" w:sz="4"/>
-            </w:tcBorders>
-            <w:shd w:fill="F5F7FA" w:val="clear"/>
-            <w:tcMar>
-              <w:top w:type="dxa" w:w="60"/>
-              <w:left w:type="dxa" w:w="100"/>
-              <w:bottom w:type="dxa" w:w="60"/>
-              <w:right w:type="dxa" w:w="100"/>
-            </w:tcMar>
-          </w:tcPr>
-          <w:p>
-            <w:r>
-              <w:rPr>
-                <w:b w:val="false"/>
-                <w:bCs w:val="false"/>
-                <w:sz w:val="19"/>
-                <w:szCs w:val="19"/>
-              </w:rPr>
-              <w:t xml:space="preserve">GET /metrics</w:t>
-            </w:r>
-          </w:p>
-        </w:tc>
-        <w:tc>
-          <w:tcPr>
-            <w:tcW w:type="dxa" w:w="6826"/>
-            <w:tcBorders>
-              <w:top w:val="single" w:color="BFC5CC" w:sz="4"/>
-              <w:left w:val="single" w:color="BFC5CC" w:sz="4"/>
-              <w:bottom w:val="single" w:color="BFC5CC" w:sz="4"/>
-              <w:right w:val="single" w:color="BFC5CC" w:sz="4"/>
-            </w:tcBorders>
-            <w:shd w:fill="F5F7FA" w:val="clear"/>
-            <w:tcMar>
-              <w:top w:type="dxa" w:w="60"/>
-              <w:left w:type="dxa" w:w="100"/>
-              <w:bottom w:type="dxa" w:w="60"/>
-              <w:right w:type="dxa" w:w="100"/>
-            </w:tcMar>
-          </w:tcPr>
-          <w:p>
-            <w:r>
-              <w:rPr>
-                <w:b w:val="false"/>
-                <w:bCs w:val="false"/>
-                <w:sz w:val="19"/>
-                <w:szCs w:val="19"/>
-              </w:rPr>
-              <w:t xml:space="preserve">Prometheus exposition format</w:t>
-            </w:r>
-          </w:p>
-        </w:tc>
-      </w:tr>
-      <w:tr>
-        <w:trPr>
-          <w:tblHeader w:val="false"/>
-        </w:trPr>
-        <w:tc>
-          <w:tcPr>
-            <w:tcW w:type="dxa" w:w="2200"/>
-            <w:tcBorders>
-              <w:top w:val="single" w:color="BFC5CC" w:sz="4"/>
-              <w:left w:val="single" w:color="BFC5CC" w:sz="4"/>
-              <w:bottom w:val="single" w:color="BFC5CC" w:sz="4"/>
-              <w:right w:val="single" w:color="BFC5CC" w:sz="4"/>
-            </w:tcBorders>
-            <w:tcMar>
-              <w:top w:type="dxa" w:w="60"/>
-              <w:left w:type="dxa" w:w="100"/>
-              <w:bottom w:type="dxa" w:w="60"/>
-              <w:right w:type="dxa" w:w="100"/>
-            </w:tcMar>
-          </w:tcPr>
-          <w:p>
-            <w:r>
-              <w:rPr>
-                <w:b w:val="false"/>
-                <w:bCs w:val="false"/>
-                <w:sz w:val="19"/>
-                <w:szCs w:val="19"/>
-              </w:rPr>
-              <w:t xml:space="preserve">GET /docs</w:t>
-            </w:r>
-          </w:p>
-        </w:tc>
-        <w:tc>
-          <w:tcPr>
-            <w:tcW w:type="dxa" w:w="6826"/>
-            <w:tcBorders>
-              <w:top w:val="single" w:color="BFC5CC" w:sz="4"/>
-              <w:left w:val="single" w:color="BFC5CC" w:sz="4"/>
-              <w:bottom w:val="single" w:color="BFC5CC" w:sz="4"/>
-              <w:right w:val="single" w:color="BFC5CC" w:sz="4"/>
-            </w:tcBorders>
-            <w:tcMar>
-              <w:top w:type="dxa" w:w="60"/>
-              <w:left w:type="dxa" w:w="100"/>
-              <w:bottom w:type="dxa" w:w="60"/>
-              <w:right w:type="dxa" w:w="100"/>
-            </w:tcMar>
-          </w:tcPr>
-          <w:p>
-            <w:r>
-              <w:rPr>
-                <w:b w:val="false"/>
-                <w:bCs w:val="false"/>
-                <w:sz w:val="19"/>
-                <w:szCs w:val="19"/>
-              </w:rPr>
-              <w:t xml:space="preserve">Interactive Swagger UI</w:t>
-            </w:r>
-          </w:p>
-        </w:tc>
-      </w:tr>
-    </w:tbl>
-    <w:p>
-      <w:pPr>
-        <w:spacing w:after="160"/>
-      </w:pPr>
-    </w:p>
-    <w:p>
-      <w:pPr>
-        <w:spacing w:after="120" w:line="276"/>
-      </w:pPr>
-      <w:r>
-        <w:t xml:space="preserve">Input is validated by a Pydantic schema with types, ranges and allowed codes taken from the UCI data dictionary. ca and thal may be null and are imputed by the pipeline. Confidence is the probability of the predicted class.</w:t>
-      </w:r>
-    </w:p>
-    <w:p>
-      <w:pPr>
-        <w:spacing w:after="120" w:line="276"/>
-      </w:pPr>
-      <w:r>
-        <w:t xml:space="preserve">The Dockerfile uses python:3.12-slim, installs dependencies in a separate layer for caching, runs as a non-root user, and defines a HEALTHCHECK. It runs a single uvicorn worker because Prometheus metrics are kept in-process; scaling is done with replicas.</w:t>
-      </w:r>
-    </w:p>
-    <w:p>
-      <w:pPr>
-        <w:shd w:fill="F3F4F6" w:val="clear"/>
-        <w:spacing w:after="0"/>
-        <w:ind w:left="200"/>
-      </w:pPr>
+        <w:t xml:space="preserve">10. Monitoring and Logging</w:t>
+      </w:r>
+    </w:p>
+    <w:p>
+      <w:pPr>
+        <w:pStyle w:val="ListParagraph"/>
+        <w:numPr>
+          <w:ilvl w:val="0"/>
+          <w:numId w:val="2"/>
+        </w:numPr>
+        <w:spacing w:after="60"/>
+      </w:pPr>
+      <w:r>
+        <w:t xml:space="preserve">Logging: every request is written to stdout as one JSON line containing request_id, method, path, status and latency_ms. Every prediction also logs its label. The request id is returned in the x-request-id header, so a client error can be traced in the logs (</w:t>
+      </w:r>
       <w:r>
         <w:rPr>
-          <w:rFonts w:ascii="Consolas" w:cs="Consolas" w:eastAsia="Consolas" w:hAnsi="Consolas"/>
-          <w:sz w:val="18"/>
-          <w:szCs w:val="18"/>
+          <w:b/>
+          <w:bCs/>
         </w:rPr>
-        <w:t xml:space="preserve">&gt; curl -X POST localhost:8000/predict -H "Content-Type: application/json" -d @sample_request.json</w:t>
-      </w:r>
-    </w:p>
-    <w:p>
-      <w:pPr>
-        <w:shd w:fill="F3F4F6" w:val="clear"/>
-        <w:spacing w:after="0"/>
-        <w:ind w:left="200"/>
-      </w:pPr>
+        <w:t xml:space="preserve">kubectl logs</w:t>
+      </w:r>
+      <w:r>
+        <w:t xml:space="preserve"> or </w:t>
+      </w:r>
       <w:r>
         <w:rPr>
-          <w:rFonts w:ascii="Consolas" w:cs="Consolas" w:eastAsia="Consolas" w:hAnsi="Consolas"/>
-          <w:sz w:val="18"/>
-          <w:szCs w:val="18"/>
+          <w:b/>
+          <w:bCs/>
         </w:rPr>
-        <w:t xml:space="preserve">{"prediction":1,"label":"disease","risk_probability":0.9947,"confidence":0.9947,</w:t>
-      </w:r>
-    </w:p>
-    <w:p>
-      <w:pPr>
-        <w:shd w:fill="F3F4F6" w:val="clear"/>
-        <w:spacing w:after="0"/>
-        <w:ind w:left="200"/>
-      </w:pPr>
-      <w:r>
-        <w:rPr>
-          <w:rFonts w:ascii="Consolas" w:cs="Consolas" w:eastAsia="Consolas" w:hAnsi="Consolas"/>
-          <w:sz w:val="18"/>
-          <w:szCs w:val="18"/>
-        </w:rPr>
-        <w:t xml:space="preserve"> "model_name":"logistic_regression","model_version":"2026-10-19T14:34:39+00:00","request_id":"d1c72857920a"}</w:t>
-      </w:r>
-    </w:p>
-    <w:p>
-      <w:pPr>
-        <w:spacing w:after="120"/>
-      </w:pPr>
+        <w:t xml:space="preserve">docker logs</w:t>
+      </w:r>
+      <w:r>
+        <w:t xml:space="preserve">).</w:t>
+      </w:r>
+    </w:p>
+    <w:p>
+      <w:pPr>
+        <w:pStyle w:val="ListParagraph"/>
+        <w:numPr>
+          <w:ilvl w:val="0"/>
+          <w:numId w:val="2"/>
+        </w:numPr>
+        <w:spacing w:after="60"/>
+      </w:pPr>
+      <w:r>
+        <w:t xml:space="preserve">Metrics, exposed through prometheus_client: request count by path and status, a latency histogram, predictions by class, a histogram of predicted risk (useful for spotting drift), and a model-loaded gauge.</w:t>
+      </w:r>
+    </w:p>
+    <w:p>
+      <w:pPr>
+        <w:pStyle w:val="ListParagraph"/>
+        <w:numPr>
+          <w:ilvl w:val="0"/>
+          <w:numId w:val="2"/>
+        </w:numPr>
+        <w:spacing w:after="60"/>
+      </w:pPr>
+      <w:r>
+        <w:t xml:space="preserve">Dashboard: docker compose starts the API, Prometheus and Grafana. The provisioned dashboard shows requests per second, p95 latency, the class mix, mean predicted risk, model status and error rate. scripts/load_test.py generates traffic that includes deliberately invalid requests, so the error panel has data.</w:t>
+      </w:r>
     </w:p>
     <w:p>
       <w:pPr>
@@ -4942,9 +5171,9 @@
       <w:r>
         <w:drawing>
           <wp:inline distT="0" distB="0" distL="0" distR="0">
-            <wp:extent cx="5715000" cy="2647950"/>
+            <wp:extent cx="5334000" cy="2466975"/>
             <wp:effectExtent t="0" r="0" b="0" l="0"/>
-            <wp:docPr id="1" name="swagger.jpg" descr="Figure 11. Swagger UI of the running container" title="Figure 11. Swagger UI of the running container"/>
+            <wp:docPr id="1" name="grafana.jpg" descr="Figure 11. Grafana dashboard under load" title="Figure 11. Grafana dashboard under load"/>
             <wp:cNvGraphicFramePr>
               <a:graphicFrameLocks xmlns:a="http://schemas.openxmlformats.org/drawingml/2006/main" noChangeAspect="1"/>
             </wp:cNvGraphicFramePr>
@@ -4967,7 +5196,7 @@
                   <pic:spPr bwMode="auto">
                     <a:xfrm>
                       <a:off x="0" y="0"/>
-                      <a:ext cx="5715000" cy="2647950"/>
+                      <a:ext cx="5334000" cy="2466975"/>
                     </a:xfrm>
                     <a:prstGeom prst="rect">
                       <a:avLst/>
@@ -4993,7 +5222,7 @@
           <w:sz w:val="18"/>
           <w:szCs w:val="18"/>
         </w:rPr>
-        <w:t xml:space="preserve">Figure 11. Swagger UI of the running container</w:t>
+        <w:t xml:space="preserve">Figure 11. Grafana dashboard under load</w:t>
       </w:r>
     </w:p>
     <w:p>
@@ -5001,7 +5230,15 @@
         <w:pStyle w:val="Heading1"/>
       </w:pPr>
       <w:r>
-        <w:t xml:space="preserve">9. Production Deployment</w:t>
+        <w:t xml:space="preserve">11. Production-Readiness Evidence</w:t>
+      </w:r>
+    </w:p>
+    <w:p>
+      <w:pPr>
+        <w:pStyle w:val="Heading2"/>
+      </w:pPr>
+      <w:r>
+        <w:t xml:space="preserve">11.1 All scripts execute from a clean setup using the requirements file</w:t>
       </w:r>
     </w:p>
     <w:p>
@@ -5009,215 +5246,8 @@
         <w:spacing w:after="120" w:line="276"/>
       </w:pPr>
       <w:r>
-        <w:t xml:space="preserve">The image is deployed to the Kubernetes cluster built into Docker Desktop (v1.36). The k8s/ directory contains:</w:t>
-      </w:r>
-    </w:p>
-    <w:p>
-      <w:pPr>
-        <w:pStyle w:val="ListParagraph"/>
-        <w:numPr>
-          <w:ilvl w:val="0"/>
-          <w:numId w:val="2"/>
-        </w:numPr>
-        <w:spacing w:after="60"/>
-      </w:pPr>
-      <w:r>
-        <w:t xml:space="preserve">deployment.yaml: 2 replicas, a RollingUpdate strategy with maxUnavailable 0, CPU and memory requests and limits, readiness and liveness probes on /health, and prometheus.io annotations.</w:t>
-      </w:r>
-    </w:p>
-    <w:p>
-      <w:pPr>
-        <w:pStyle w:val="ListParagraph"/>
-        <w:numPr>
-          <w:ilvl w:val="0"/>
-          <w:numId w:val="2"/>
-        </w:numPr>
-        <w:spacing w:after="60"/>
-      </w:pPr>
-      <w:r>
-        <w:t xml:space="preserve">service.yaml: a LoadBalancer on port 8080 → 8000. Docker Desktop exposes it on localhost; on GKE, EKS or AKS a cloud load balancer IP is assigned.</w:t>
-      </w:r>
-    </w:p>
-    <w:p>
-      <w:pPr>
-        <w:pStyle w:val="ListParagraph"/>
-        <w:numPr>
-          <w:ilvl w:val="0"/>
-          <w:numId w:val="2"/>
-        </w:numPr>
-        <w:spacing w:after="60"/>
-      </w:pPr>
-      <w:r>
-        <w:t xml:space="preserve">ingress.yaml: optional nginx ingress for host heart.local.</w:t>
-      </w:r>
-    </w:p>
-    <w:p>
-      <w:pPr>
-        <w:pStyle w:val="ListParagraph"/>
-        <w:numPr>
-          <w:ilvl w:val="0"/>
-          <w:numId w:val="2"/>
-        </w:numPr>
-        <w:spacing w:after="60"/>
-      </w:pPr>
-      <w:r>
-        <w:t xml:space="preserve">monitoring.yaml: an in-cluster Prometheus with RBAC that discovers the API pods through their annotations.</w:t>
-      </w:r>
-    </w:p>
-    <w:p>
-      <w:pPr>
-        <w:shd w:fill="F3F4F6" w:val="clear"/>
-        <w:spacing w:after="0"/>
-        <w:ind w:left="200"/>
-      </w:pPr>
-      <w:r>
-        <w:rPr>
-          <w:rFonts w:ascii="Consolas" w:cs="Consolas" w:eastAsia="Consolas" w:hAnsi="Consolas"/>
-          <w:sz w:val="18"/>
-          <w:szCs w:val="18"/>
-        </w:rPr>
-        <w:t xml:space="preserve">&gt; kubectl -n heart get pods,svc</w:t>
-      </w:r>
-    </w:p>
-    <w:p>
-      <w:pPr>
-        <w:shd w:fill="F3F4F6" w:val="clear"/>
-        <w:spacing w:after="0"/>
-        <w:ind w:left="200"/>
-      </w:pPr>
-      <w:r>
-        <w:rPr>
-          <w:rFonts w:ascii="Consolas" w:cs="Consolas" w:eastAsia="Consolas" w:hAnsi="Consolas"/>
-          <w:sz w:val="18"/>
-          <w:szCs w:val="18"/>
-        </w:rPr>
-        <w:t xml:space="preserve">NAME                              READY   STATUS    RESTARTS   AGE</w:t>
-      </w:r>
-    </w:p>
-    <w:p>
-      <w:pPr>
-        <w:shd w:fill="F3F4F6" w:val="clear"/>
-        <w:spacing w:after="0"/>
-        <w:ind w:left="200"/>
-      </w:pPr>
-      <w:r>
-        <w:rPr>
-          <w:rFonts w:ascii="Consolas" w:cs="Consolas" w:eastAsia="Consolas" w:hAnsi="Consolas"/>
-          <w:sz w:val="18"/>
-          <w:szCs w:val="18"/>
-        </w:rPr>
-        <w:t xml:space="preserve">pod/heart-api-657df84c85-6zz8s    1/1     Running   0          12s</w:t>
-      </w:r>
-    </w:p>
-    <w:p>
-      <w:pPr>
-        <w:shd w:fill="F3F4F6" w:val="clear"/>
-        <w:spacing w:after="0"/>
-        <w:ind w:left="200"/>
-      </w:pPr>
-      <w:r>
-        <w:rPr>
-          <w:rFonts w:ascii="Consolas" w:cs="Consolas" w:eastAsia="Consolas" w:hAnsi="Consolas"/>
-          <w:sz w:val="18"/>
-          <w:szCs w:val="18"/>
-        </w:rPr>
-        <w:t xml:space="preserve">pod/heart-api-657df84c85-tq8md    1/1     Running   0          12s</w:t>
-      </w:r>
-    </w:p>
-    <w:p>
-      <w:pPr>
-        <w:shd w:fill="F3F4F6" w:val="clear"/>
-        <w:spacing w:after="0"/>
-        <w:ind w:left="200"/>
-      </w:pPr>
-      <w:r>
-        <w:rPr>
-          <w:rFonts w:ascii="Consolas" w:cs="Consolas" w:eastAsia="Consolas" w:hAnsi="Consolas"/>
-          <w:sz w:val="18"/>
-          <w:szCs w:val="18"/>
-        </w:rPr>
-        <w:t xml:space="preserve">pod/prometheus-7476c4cc5f-6zdsh   1/1     Running   0          12s</w:t>
-      </w:r>
-    </w:p>
-    <w:p>
-      <w:pPr>
-        <w:shd w:fill="F3F4F6" w:val="clear"/>
-        <w:spacing w:after="0"/>
-        <w:ind w:left="200"/>
-      </w:pPr>
-      <w:r>
-        <w:rPr>
-          <w:rFonts w:ascii="Consolas" w:cs="Consolas" w:eastAsia="Consolas" w:hAnsi="Consolas"/>
-          <w:sz w:val="18"/>
-          <w:szCs w:val="18"/>
-        </w:rPr>
-        <w:t xml:space="preserve">NAME                 TYPE           CLUSTER-IP      EXTERNAL-IP   PORT(S)</w:t>
-      </w:r>
-    </w:p>
-    <w:p>
-      <w:pPr>
-        <w:shd w:fill="F3F4F6" w:val="clear"/>
-        <w:spacing w:after="0"/>
-        <w:ind w:left="200"/>
-      </w:pPr>
-      <w:r>
-        <w:rPr>
-          <w:rFonts w:ascii="Consolas" w:cs="Consolas" w:eastAsia="Consolas" w:hAnsi="Consolas"/>
-          <w:sz w:val="18"/>
-          <w:szCs w:val="18"/>
-        </w:rPr>
-        <w:t xml:space="preserve">service/heart-api    LoadBalancer   10.96.194.11    172.22.0.5    8080:31226/TCP</w:t>
-      </w:r>
-    </w:p>
-    <w:p>
-      <w:pPr>
-        <w:shd w:fill="F3F4F6" w:val="clear"/>
-        <w:spacing w:after="0"/>
-        <w:ind w:left="200"/>
-      </w:pPr>
-      <w:r>
-        <w:rPr>
-          <w:rFonts w:ascii="Consolas" w:cs="Consolas" w:eastAsia="Consolas" w:hAnsi="Consolas"/>
-          <w:sz w:val="18"/>
-          <w:szCs w:val="18"/>
-        </w:rPr>
-        <w:t xml:space="preserve">service/prometheus   ClusterIP      10.96.213.218   &lt;none&gt;        9090/TCP</w:t>
-      </w:r>
-    </w:p>
-    <w:p>
-      <w:pPr>
-        <w:shd w:fill="F3F4F6" w:val="clear"/>
-        <w:spacing w:after="0"/>
-        <w:ind w:left="200"/>
-      </w:pPr>
-      <w:r>
-        <w:rPr>
-          <w:rFonts w:ascii="Consolas" w:cs="Consolas" w:eastAsia="Consolas" w:hAnsi="Consolas"/>
-          <w:sz w:val="18"/>
-          <w:szCs w:val="18"/>
-        </w:rPr>
-        <w:t xml:space="preserve">&gt; curl localhost:8080/health</w:t>
-      </w:r>
-    </w:p>
-    <w:p>
-      <w:pPr>
-        <w:shd w:fill="F3F4F6" w:val="clear"/>
-        <w:spacing w:after="0"/>
-        <w:ind w:left="200"/>
-      </w:pPr>
-      <w:r>
-        <w:rPr>
-          <w:rFonts w:ascii="Consolas" w:cs="Consolas" w:eastAsia="Consolas" w:hAnsi="Consolas"/>
-          <w:sz w:val="18"/>
-          <w:szCs w:val="18"/>
-        </w:rPr>
-        <w:t xml:space="preserve">{"status":"ok","model":"logistic_regression","test_roc_auc":0.9589}</w:t>
-      </w:r>
-    </w:p>
-    <w:p>
-      <w:pPr>
-        <w:spacing w:after="120"/>
-      </w:pPr>
+        <w:t xml:space="preserve">The recorded demo starts by deleting the virtual environment and recreating it from scratch, then installs every dependency only from requirements.txt (exact pinned versions). Every later stage of the video (training, tests, serving) runs in that fresh environment. The GitHub Actions jobs prove the same thing on a brand-new Ubuntu runner on every push, and scripts/run_all.sh runs all stages in one command on any clean Linux VM.</w:t>
+      </w:r>
     </w:p>
     <w:p>
       <w:pPr>
@@ -5227,9 +5257,9 @@
       <w:r>
         <w:drawing>
           <wp:inline distT="0" distB="0" distL="0" distR="0">
-            <wp:extent cx="5715000" cy="2066925"/>
+            <wp:extent cx="4762500" cy="2686050"/>
             <wp:effectExtent t="0" r="0" b="0" l="0"/>
-            <wp:docPr id="1" name="k8s_pods.png" descr="Figure 12. Kubernetes pods and service" title="Figure 12. Kubernetes pods and service"/>
+            <wp:docPr id="1" name="video_clean_install.png" descr="Figure 12. Fresh virtual environment; dependencies installed only from requirements.txt (from the video)" title="Figure 12. Fresh virtual environment; dependencies installed only from requirements.txt (from the video)"/>
             <wp:cNvGraphicFramePr>
               <a:graphicFrameLocks xmlns:a="http://schemas.openxmlformats.org/drawingml/2006/main" noChangeAspect="1"/>
             </wp:cNvGraphicFramePr>
@@ -5252,7 +5282,7 @@
                   <pic:spPr bwMode="auto">
                     <a:xfrm>
                       <a:off x="0" y="0"/>
-                      <a:ext cx="5715000" cy="2066925"/>
+                      <a:ext cx="4762500" cy="2686050"/>
                     </a:xfrm>
                     <a:prstGeom prst="rect">
                       <a:avLst/>
@@ -5278,74 +5308,23 @@
           <w:sz w:val="18"/>
           <w:szCs w:val="18"/>
         </w:rPr>
-        <w:t xml:space="preserve">Figure 12. Kubernetes pods and service</w:t>
-      </w:r>
-    </w:p>
-    <w:p>
-      <w:pPr>
-        <w:pStyle w:val="Heading1"/>
-      </w:pPr>
-      <w:r>
-        <w:t xml:space="preserve">10. Monitoring and Logging</w:t>
-      </w:r>
-    </w:p>
-    <w:p>
-      <w:pPr>
-        <w:pStyle w:val="ListParagraph"/>
-        <w:numPr>
-          <w:ilvl w:val="0"/>
-          <w:numId w:val="2"/>
-        </w:numPr>
-        <w:spacing w:after="60"/>
-      </w:pPr>
-      <w:r>
-        <w:t xml:space="preserve">Logging: every request is written to stdout as one JSON line containing request_id, method, path, status and latency_ms. Every prediction also logs its label. The request id is returned in the x-request-id header, so a client error can be traced in the logs (</w:t>
-      </w:r>
-      <w:r>
-        <w:rPr>
-          <w:b/>
-          <w:bCs/>
-        </w:rPr>
-        <w:t xml:space="preserve">kubectl logs</w:t>
-      </w:r>
-      <w:r>
-        <w:t xml:space="preserve"> or </w:t>
-      </w:r>
-      <w:r>
-        <w:rPr>
-          <w:b/>
-          <w:bCs/>
-        </w:rPr>
-        <w:t xml:space="preserve">docker logs</w:t>
-      </w:r>
-      <w:r>
-        <w:t xml:space="preserve">).</w:t>
-      </w:r>
-    </w:p>
-    <w:p>
-      <w:pPr>
-        <w:pStyle w:val="ListParagraph"/>
-        <w:numPr>
-          <w:ilvl w:val="0"/>
-          <w:numId w:val="2"/>
-        </w:numPr>
-        <w:spacing w:after="60"/>
-      </w:pPr>
-      <w:r>
-        <w:t xml:space="preserve">Metrics, exposed through prometheus_client: request count by path and status, a latency histogram, predictions by class, a histogram of predicted risk (useful for spotting drift), and a model-loaded gauge.</w:t>
-      </w:r>
-    </w:p>
-    <w:p>
-      <w:pPr>
-        <w:pStyle w:val="ListParagraph"/>
-        <w:numPr>
-          <w:ilvl w:val="0"/>
-          <w:numId w:val="2"/>
-        </w:numPr>
-        <w:spacing w:after="60"/>
-      </w:pPr>
-      <w:r>
-        <w:t xml:space="preserve">Dashboard: docker compose starts the API, Prometheus and Grafana. The provisioned dashboard shows requests per second, p95 latency, the class mix, mean predicted risk, model status and error rate. scripts/load_test.py generates traffic that includes deliberately invalid requests, so the error panel has data.</w:t>
+        <w:t xml:space="preserve">Figure 12. Fresh virtual environment; dependencies installed only from requirements.txt (from the video)</w:t>
+      </w:r>
+    </w:p>
+    <w:p>
+      <w:pPr>
+        <w:pStyle w:val="Heading2"/>
+      </w:pPr>
+      <w:r>
+        <w:t xml:space="preserve">11.2 Model serves correctly in an isolated environment (Docker build/test proof)</w:t>
+      </w:r>
+    </w:p>
+    <w:p>
+      <w:pPr>
+        <w:spacing w:after="120" w:line="276"/>
+      </w:pPr>
+      <w:r>
+        <w:t xml:space="preserve">The serving image is built from the Dockerfile (python:3.12-slim, non-root user, HEALTHCHECK) and contains only requirements-serve.txt, the code and the model artefact. Proof is provided three ways: (1) the video shows the image building and the container answering POST /predict; (2) the docker CI job builds the image on a clean runner, starts it, and fails the pipeline unless /health and /predict respond correctly; (3) the same image runs as 2 healthy replicas on Kubernetes behind a LoadBalancer.</w:t>
       </w:r>
     </w:p>
     <w:p>
@@ -5356,9 +5335,9 @@
       <w:r>
         <w:drawing>
           <wp:inline distT="0" distB="0" distL="0" distR="0">
-            <wp:extent cx="5715000" cy="2647950"/>
+            <wp:extent cx="4762500" cy="2686050"/>
             <wp:effectExtent t="0" r="0" b="0" l="0"/>
-            <wp:docPr id="1" name="grafana.jpg" descr="Figure 13. Grafana dashboard under load" title="Figure 13. Grafana dashboard under load"/>
+            <wp:docPr id="1" name="video_docker_build.png" descr="Figure 13. Docker image build and running containers (from the video)" title="Figure 13. Docker image build and running containers (from the video)"/>
             <wp:cNvGraphicFramePr>
               <a:graphicFrameLocks xmlns:a="http://schemas.openxmlformats.org/drawingml/2006/main" noChangeAspect="1"/>
             </wp:cNvGraphicFramePr>
@@ -5381,7 +5360,7 @@
                   <pic:spPr bwMode="auto">
                     <a:xfrm>
                       <a:off x="0" y="0"/>
-                      <a:ext cx="5715000" cy="2647950"/>
+                      <a:ext cx="4762500" cy="2686050"/>
                     </a:xfrm>
                     <a:prstGeom prst="rect">
                       <a:avLst/>
@@ -5407,7 +5386,209 @@
           <w:sz w:val="18"/>
           <w:szCs w:val="18"/>
         </w:rPr>
-        <w:t xml:space="preserve">Figure 13. Grafana dashboard under load</w:t>
+        <w:t xml:space="preserve">Figure 13. Docker image build and running containers (from the video)</w:t>
+      </w:r>
+    </w:p>
+    <w:p>
+      <w:pPr>
+        <w:spacing w:after="40"/>
+        <w:jc w:val="center"/>
+      </w:pPr>
+      <w:r>
+        <w:drawing>
+          <wp:inline distT="0" distB="0" distL="0" distR="0">
+            <wp:extent cx="4762500" cy="2686050"/>
+            <wp:effectExtent t="0" r="0" b="0" l="0"/>
+            <wp:docPr id="1" name="video_k8s_loadtest.png" descr="Figure 14. Container /predict response, Kubernetes pods/service and load test (from the video)" title="Figure 14. Container /predict response, Kubernetes pods/service and load test (from the video)"/>
+            <wp:cNvGraphicFramePr>
+              <a:graphicFrameLocks xmlns:a="http://schemas.openxmlformats.org/drawingml/2006/main" noChangeAspect="1"/>
+            </wp:cNvGraphicFramePr>
+            <a:graphic xmlns:a="http://schemas.openxmlformats.org/drawingml/2006/main">
+              <a:graphicData uri="http://schemas.openxmlformats.org/drawingml/2006/picture">
+                <pic:pic xmlns:pic="http://schemas.openxmlformats.org/drawingml/2006/picture">
+                  <pic:nvPicPr>
+                    <pic:cNvPr id="0" name="" descr=""/>
+                    <pic:cNvPicPr>
+                      <a:picLocks noChangeAspect="1" noChangeArrowheads="1"/>
+                    </pic:cNvPicPr>
+                  </pic:nvPicPr>
+                  <pic:blipFill>
+                    <a:blip r:embed="rId21" cstate="none"/>
+                    <a:srcRect/>
+                    <a:stretch>
+                      <a:fillRect/>
+                    </a:stretch>
+                  </pic:blipFill>
+                  <pic:spPr bwMode="auto">
+                    <a:xfrm>
+                      <a:off x="0" y="0"/>
+                      <a:ext cx="4762500" cy="2686050"/>
+                    </a:xfrm>
+                    <a:prstGeom prst="rect">
+                      <a:avLst/>
+                    </a:prstGeom>
+                  </pic:spPr>
+                </pic:pic>
+              </a:graphicData>
+            </a:graphic>
+          </wp:inline>
+        </w:drawing>
+      </w:r>
+    </w:p>
+    <w:p>
+      <w:pPr>
+        <w:spacing w:after="200"/>
+        <w:jc w:val="center"/>
+      </w:pPr>
+      <w:r>
+        <w:rPr>
+          <w:i/>
+          <w:iCs/>
+          <w:color w:val="555555"/>
+          <w:sz w:val="18"/>
+          <w:szCs w:val="18"/>
+        </w:rPr>
+        <w:t xml:space="preserve">Figure 14. Container /predict response, Kubernetes pods/service and load test (from the video)</w:t>
+      </w:r>
+    </w:p>
+    <w:p>
+      <w:pPr>
+        <w:pStyle w:val="Heading2"/>
+      </w:pPr>
+      <w:r>
+        <w:t xml:space="preserve">11.3 Pipeline fails on code or test errors and gives clear logs</w:t>
+      </w:r>
+    </w:p>
+    <w:p>
+      <w:pPr>
+        <w:spacing w:after="120" w:line="276"/>
+      </w:pPr>
+      <w:r>
+        <w:t xml:space="preserve">Every CI step returns a non-zero exit code on failure, and the jobs are chained with needs: lint → test → train → docker, so the first failure stops the pipeline and marks the run red. Two extra gates: training fails if test ROC-AUC &lt; 0.80, and the docker job fails if the container does not answer /health and /predict. To demonstrate, a copy of the code was deliberately broken (an unused import and a wrong target threshold). flake8 reports the exact file, line and rule; pytest reports the failing test with the assertion diff; both exit with code 1, which fails the corresponding GitHub Actions job.</w:t>
+      </w:r>
+    </w:p>
+    <w:p>
+      <w:pPr>
+        <w:spacing w:after="40"/>
+        <w:jc w:val="center"/>
+      </w:pPr>
+      <w:r>
+        <w:drawing>
+          <wp:inline distT="0" distB="0" distL="0" distR="0">
+            <wp:extent cx="5143500" cy="2238375"/>
+            <wp:effectExtent t="0" r="0" b="0" l="0"/>
+            <wp:docPr id="1" name="ci_fail_demo.png" descr="Figure 15. Deliberately broken code: flake8 and pytest fail with line-level logs and exit code 1" title="Figure 15. Deliberately broken code: flake8 and pytest fail with line-level logs and exit code 1"/>
+            <wp:cNvGraphicFramePr>
+              <a:graphicFrameLocks xmlns:a="http://schemas.openxmlformats.org/drawingml/2006/main" noChangeAspect="1"/>
+            </wp:cNvGraphicFramePr>
+            <a:graphic xmlns:a="http://schemas.openxmlformats.org/drawingml/2006/main">
+              <a:graphicData uri="http://schemas.openxmlformats.org/drawingml/2006/picture">
+                <pic:pic xmlns:pic="http://schemas.openxmlformats.org/drawingml/2006/picture">
+                  <pic:nvPicPr>
+                    <pic:cNvPr id="0" name="" descr=""/>
+                    <pic:cNvPicPr>
+                      <a:picLocks noChangeAspect="1" noChangeArrowheads="1"/>
+                    </pic:cNvPicPr>
+                  </pic:nvPicPr>
+                  <pic:blipFill>
+                    <a:blip r:embed="rId22" cstate="none"/>
+                    <a:srcRect/>
+                    <a:stretch>
+                      <a:fillRect/>
+                    </a:stretch>
+                  </pic:blipFill>
+                  <pic:spPr bwMode="auto">
+                    <a:xfrm>
+                      <a:off x="0" y="0"/>
+                      <a:ext cx="5143500" cy="2238375"/>
+                    </a:xfrm>
+                    <a:prstGeom prst="rect">
+                      <a:avLst/>
+                    </a:prstGeom>
+                  </pic:spPr>
+                </pic:pic>
+              </a:graphicData>
+            </a:graphic>
+          </wp:inline>
+        </w:drawing>
+      </w:r>
+    </w:p>
+    <w:p>
+      <w:pPr>
+        <w:spacing w:after="200"/>
+        <w:jc w:val="center"/>
+      </w:pPr>
+      <w:r>
+        <w:rPr>
+          <w:i/>
+          <w:iCs/>
+          <w:color w:val="555555"/>
+          <w:sz w:val="18"/>
+          <w:szCs w:val="18"/>
+        </w:rPr>
+        <w:t xml:space="preserve">Figure 15. Deliberately broken code: flake8 and pytest fail with line-level logs and exit code 1</w:t>
+      </w:r>
+    </w:p>
+    <w:p>
+      <w:pPr>
+        <w:spacing w:after="40"/>
+        <w:jc w:val="center"/>
+      </w:pPr>
+      <w:r>
+        <w:drawing>
+          <wp:inline distT="0" distB="0" distL="0" distR="0">
+            <wp:extent cx="4762500" cy="2686050"/>
+            <wp:effectExtent t="0" r="0" b="0" l="0"/>
+            <wp:docPr id="1" name="video_lint_tests.png" descr="Figure 16. Correct code: flake8 passes and all 24 tests pass (from the video)" title="Figure 16. Correct code: flake8 passes and all 24 tests pass (from the video)"/>
+            <wp:cNvGraphicFramePr>
+              <a:graphicFrameLocks xmlns:a="http://schemas.openxmlformats.org/drawingml/2006/main" noChangeAspect="1"/>
+            </wp:cNvGraphicFramePr>
+            <a:graphic xmlns:a="http://schemas.openxmlformats.org/drawingml/2006/main">
+              <a:graphicData uri="http://schemas.openxmlformats.org/drawingml/2006/picture">
+                <pic:pic xmlns:pic="http://schemas.openxmlformats.org/drawingml/2006/picture">
+                  <pic:nvPicPr>
+                    <pic:cNvPr id="0" name="" descr=""/>
+                    <pic:cNvPicPr>
+                      <a:picLocks noChangeAspect="1" noChangeArrowheads="1"/>
+                    </pic:cNvPicPr>
+                  </pic:nvPicPr>
+                  <pic:blipFill>
+                    <a:blip r:embed="rId23" cstate="none"/>
+                    <a:srcRect/>
+                    <a:stretch>
+                      <a:fillRect/>
+                    </a:stretch>
+                  </pic:blipFill>
+                  <pic:spPr bwMode="auto">
+                    <a:xfrm>
+                      <a:off x="0" y="0"/>
+                      <a:ext cx="4762500" cy="2686050"/>
+                    </a:xfrm>
+                    <a:prstGeom prst="rect">
+                      <a:avLst/>
+                    </a:prstGeom>
+                  </pic:spPr>
+                </pic:pic>
+              </a:graphicData>
+            </a:graphic>
+          </wp:inline>
+        </w:drawing>
+      </w:r>
+    </w:p>
+    <w:p>
+      <w:pPr>
+        <w:spacing w:after="200"/>
+        <w:jc w:val="center"/>
+      </w:pPr>
+      <w:r>
+        <w:rPr>
+          <w:i/>
+          <w:iCs/>
+          <w:color w:val="555555"/>
+          <w:sz w:val="18"/>
+          <w:szCs w:val="18"/>
+        </w:rPr>
+        <w:t xml:space="preserve">Figure 16. Correct code: flake8 passes and all 24 tests pass (from the video)</w:t>
       </w:r>
     </w:p>
     <w:p>
@@ -5415,24 +5596,900 @@
         <w:pStyle w:val="Heading1"/>
       </w:pPr>
       <w:r>
-        <w:t xml:space="preserve">11. Conclusion and Future Work</w:t>
-      </w:r>
-    </w:p>
-    <w:p>
-      <w:pPr>
-        <w:spacing w:after="120" w:line="276"/>
-      </w:pPr>
-      <w:r>
-        <w:t xml:space="preserve">The project delivers a reproducible pipeline from raw UCI data to a monitored, containerised API on Kubernetes, rebuilt and verified automatically on every commit. The selected Logistic Regression model reaches a cross-validated ROC-AUC of about 0.91 and a held-out recall of 0.93.</w:t>
-      </w:r>
-    </w:p>
-    <w:p>
-      <w:pPr>
-        <w:spacing w:after="120" w:line="276"/>
-      </w:pPr>
-      <w:r>
-        <w:t xml:space="preserve">Possible extensions:</w:t>
-      </w:r>
+        <w:t xml:space="preserve">12. Deliverables Checklist</w:t>
+      </w:r>
+    </w:p>
+    <w:tbl>
+      <w:tblPr>
+        <w:tblW w:type="dxa" w:w="9026"/>
+        <w:tblBorders>
+          <w:top w:val="single" w:color="auto" w:sz="4"/>
+          <w:left w:val="single" w:color="auto" w:sz="4"/>
+          <w:bottom w:val="single" w:color="auto" w:sz="4"/>
+          <w:right w:val="single" w:color="auto" w:sz="4"/>
+          <w:insideH w:val="single" w:color="auto" w:sz="4"/>
+          <w:insideV w:val="single" w:color="auto" w:sz="4"/>
+        </w:tblBorders>
+      </w:tblPr>
+      <w:tblGrid>
+        <w:gridCol w:w="3300"/>
+        <w:gridCol w:w="5726"/>
+      </w:tblGrid>
+      <w:tr>
+        <w:trPr>
+          <w:tblHeader/>
+        </w:trPr>
+        <w:tc>
+          <w:tcPr>
+            <w:tcW w:type="dxa" w:w="3300"/>
+            <w:tcBorders>
+              <w:top w:val="single" w:color="BFC5CC" w:sz="4"/>
+              <w:left w:val="single" w:color="BFC5CC" w:sz="4"/>
+              <w:bottom w:val="single" w:color="BFC5CC" w:sz="4"/>
+              <w:right w:val="single" w:color="BFC5CC" w:sz="4"/>
+            </w:tcBorders>
+            <w:shd w:fill="1F3B5C" w:val="clear"/>
+            <w:tcMar>
+              <w:top w:type="dxa" w:w="60"/>
+              <w:left w:type="dxa" w:w="100"/>
+              <w:bottom w:type="dxa" w:w="60"/>
+              <w:right w:type="dxa" w:w="100"/>
+            </w:tcMar>
+          </w:tcPr>
+          <w:p>
+            <w:r>
+              <w:rPr>
+                <w:b/>
+                <w:bCs/>
+                <w:color w:val="FFFFFF"/>
+                <w:sz w:val="19"/>
+                <w:szCs w:val="19"/>
+              </w:rPr>
+              <w:t xml:space="preserve">Deliverable</w:t>
+            </w:r>
+          </w:p>
+        </w:tc>
+        <w:tc>
+          <w:tcPr>
+            <w:tcW w:type="dxa" w:w="5726"/>
+            <w:tcBorders>
+              <w:top w:val="single" w:color="BFC5CC" w:sz="4"/>
+              <w:left w:val="single" w:color="BFC5CC" w:sz="4"/>
+              <w:bottom w:val="single" w:color="BFC5CC" w:sz="4"/>
+              <w:right w:val="single" w:color="BFC5CC" w:sz="4"/>
+            </w:tcBorders>
+            <w:shd w:fill="1F3B5C" w:val="clear"/>
+            <w:tcMar>
+              <w:top w:type="dxa" w:w="60"/>
+              <w:left w:type="dxa" w:w="100"/>
+              <w:bottom w:type="dxa" w:w="60"/>
+              <w:right w:type="dxa" w:w="100"/>
+            </w:tcMar>
+          </w:tcPr>
+          <w:p>
+            <w:r>
+              <w:rPr>
+                <w:b/>
+                <w:bCs/>
+                <w:color w:val="FFFFFF"/>
+                <w:sz w:val="19"/>
+                <w:szCs w:val="19"/>
+              </w:rPr>
+              <w:t xml:space="preserve">Where to find it</w:t>
+            </w:r>
+          </w:p>
+        </w:tc>
+      </w:tr>
+      <w:tr>
+        <w:trPr>
+          <w:tblHeader w:val="false"/>
+        </w:trPr>
+        <w:tc>
+          <w:tcPr>
+            <w:tcW w:type="dxa" w:w="3300"/>
+            <w:tcBorders>
+              <w:top w:val="single" w:color="BFC5CC" w:sz="4"/>
+              <w:left w:val="single" w:color="BFC5CC" w:sz="4"/>
+              <w:bottom w:val="single" w:color="BFC5CC" w:sz="4"/>
+              <w:right w:val="single" w:color="BFC5CC" w:sz="4"/>
+            </w:tcBorders>
+            <w:tcMar>
+              <w:top w:type="dxa" w:w="60"/>
+              <w:left w:type="dxa" w:w="100"/>
+              <w:bottom w:type="dxa" w:w="60"/>
+              <w:right w:type="dxa" w:w="100"/>
+            </w:tcMar>
+          </w:tcPr>
+          <w:p>
+            <w:r>
+              <w:rPr>
+                <w:b w:val="false"/>
+                <w:bCs w:val="false"/>
+                <w:sz w:val="19"/>
+                <w:szCs w:val="19"/>
+              </w:rPr>
+              <w:t xml:space="preserve">Code</w:t>
+            </w:r>
+          </w:p>
+        </w:tc>
+        <w:tc>
+          <w:tcPr>
+            <w:tcW w:type="dxa" w:w="5726"/>
+            <w:tcBorders>
+              <w:top w:val="single" w:color="BFC5CC" w:sz="4"/>
+              <w:left w:val="single" w:color="BFC5CC" w:sz="4"/>
+              <w:bottom w:val="single" w:color="BFC5CC" w:sz="4"/>
+              <w:right w:val="single" w:color="BFC5CC" w:sz="4"/>
+            </w:tcBorders>
+            <w:tcMar>
+              <w:top w:type="dxa" w:w="60"/>
+              <w:left w:type="dxa" w:w="100"/>
+              <w:bottom w:type="dxa" w:w="60"/>
+              <w:right w:type="dxa" w:w="100"/>
+            </w:tcMar>
+          </w:tcPr>
+          <w:p>
+            <w:r>
+              <w:rPr>
+                <w:b w:val="false"/>
+                <w:bCs w:val="false"/>
+                <w:sz w:val="19"/>
+                <w:szCs w:val="19"/>
+              </w:rPr>
+              <w:t xml:space="preserve">src/heart/ (pipeline package), api/ (FastAPI service)</w:t>
+            </w:r>
+          </w:p>
+        </w:tc>
+      </w:tr>
+      <w:tr>
+        <w:trPr>
+          <w:tblHeader w:val="false"/>
+        </w:trPr>
+        <w:tc>
+          <w:tcPr>
+            <w:tcW w:type="dxa" w:w="3300"/>
+            <w:tcBorders>
+              <w:top w:val="single" w:color="BFC5CC" w:sz="4"/>
+              <w:left w:val="single" w:color="BFC5CC" w:sz="4"/>
+              <w:bottom w:val="single" w:color="BFC5CC" w:sz="4"/>
+              <w:right w:val="single" w:color="BFC5CC" w:sz="4"/>
+            </w:tcBorders>
+            <w:shd w:fill="F5F7FA" w:val="clear"/>
+            <w:tcMar>
+              <w:top w:type="dxa" w:w="60"/>
+              <w:left w:type="dxa" w:w="100"/>
+              <w:bottom w:type="dxa" w:w="60"/>
+              <w:right w:type="dxa" w:w="100"/>
+            </w:tcMar>
+          </w:tcPr>
+          <w:p>
+            <w:r>
+              <w:rPr>
+                <w:b w:val="false"/>
+                <w:bCs w:val="false"/>
+                <w:sz w:val="19"/>
+                <w:szCs w:val="19"/>
+              </w:rPr>
+              <w:t xml:space="preserve">Dockerfile(s)</w:t>
+            </w:r>
+          </w:p>
+        </w:tc>
+        <w:tc>
+          <w:tcPr>
+            <w:tcW w:type="dxa" w:w="5726"/>
+            <w:tcBorders>
+              <w:top w:val="single" w:color="BFC5CC" w:sz="4"/>
+              <w:left w:val="single" w:color="BFC5CC" w:sz="4"/>
+              <w:bottom w:val="single" w:color="BFC5CC" w:sz="4"/>
+              <w:right w:val="single" w:color="BFC5CC" w:sz="4"/>
+            </w:tcBorders>
+            <w:shd w:fill="F5F7FA" w:val="clear"/>
+            <w:tcMar>
+              <w:top w:type="dxa" w:w="60"/>
+              <w:left w:type="dxa" w:w="100"/>
+              <w:bottom w:type="dxa" w:w="60"/>
+              <w:right w:type="dxa" w:w="100"/>
+            </w:tcMar>
+          </w:tcPr>
+          <w:p>
+            <w:r>
+              <w:rPr>
+                <w:b w:val="false"/>
+                <w:bCs w:val="false"/>
+                <w:sz w:val="19"/>
+                <w:szCs w:val="19"/>
+              </w:rPr>
+              <w:t xml:space="preserve">Dockerfile, docker-compose.yml, .dockerignore</w:t>
+            </w:r>
+          </w:p>
+        </w:tc>
+      </w:tr>
+      <w:tr>
+        <w:trPr>
+          <w:tblHeader w:val="false"/>
+        </w:trPr>
+        <w:tc>
+          <w:tcPr>
+            <w:tcW w:type="dxa" w:w="3300"/>
+            <w:tcBorders>
+              <w:top w:val="single" w:color="BFC5CC" w:sz="4"/>
+              <w:left w:val="single" w:color="BFC5CC" w:sz="4"/>
+              <w:bottom w:val="single" w:color="BFC5CC" w:sz="4"/>
+              <w:right w:val="single" w:color="BFC5CC" w:sz="4"/>
+            </w:tcBorders>
+            <w:tcMar>
+              <w:top w:type="dxa" w:w="60"/>
+              <w:left w:type="dxa" w:w="100"/>
+              <w:bottom w:type="dxa" w:w="60"/>
+              <w:right w:type="dxa" w:w="100"/>
+            </w:tcMar>
+          </w:tcPr>
+          <w:p>
+            <w:r>
+              <w:rPr>
+                <w:b w:val="false"/>
+                <w:bCs w:val="false"/>
+                <w:sz w:val="19"/>
+                <w:szCs w:val="19"/>
+              </w:rPr>
+              <w:t xml:space="preserve">requirements.txt / env</w:t>
+            </w:r>
+          </w:p>
+        </w:tc>
+        <w:tc>
+          <w:tcPr>
+            <w:tcW w:type="dxa" w:w="5726"/>
+            <w:tcBorders>
+              <w:top w:val="single" w:color="BFC5CC" w:sz="4"/>
+              <w:left w:val="single" w:color="BFC5CC" w:sz="4"/>
+              <w:bottom w:val="single" w:color="BFC5CC" w:sz="4"/>
+              <w:right w:val="single" w:color="BFC5CC" w:sz="4"/>
+            </w:tcBorders>
+            <w:tcMar>
+              <w:top w:type="dxa" w:w="60"/>
+              <w:left w:type="dxa" w:w="100"/>
+              <w:bottom w:type="dxa" w:w="60"/>
+              <w:right w:type="dxa" w:w="100"/>
+            </w:tcMar>
+          </w:tcPr>
+          <w:p>
+            <w:r>
+              <w:rPr>
+                <w:b w:val="false"/>
+                <w:bCs w:val="false"/>
+                <w:sz w:val="19"/>
+                <w:szCs w:val="19"/>
+              </w:rPr>
+              <w:t xml:space="preserve">requirements.txt (full, pinned), requirements-serve.txt (runtime)</w:t>
+            </w:r>
+          </w:p>
+        </w:tc>
+      </w:tr>
+      <w:tr>
+        <w:trPr>
+          <w:tblHeader w:val="false"/>
+        </w:trPr>
+        <w:tc>
+          <w:tcPr>
+            <w:tcW w:type="dxa" w:w="3300"/>
+            <w:tcBorders>
+              <w:top w:val="single" w:color="BFC5CC" w:sz="4"/>
+              <w:left w:val="single" w:color="BFC5CC" w:sz="4"/>
+              <w:bottom w:val="single" w:color="BFC5CC" w:sz="4"/>
+              <w:right w:val="single" w:color="BFC5CC" w:sz="4"/>
+            </w:tcBorders>
+            <w:shd w:fill="F5F7FA" w:val="clear"/>
+            <w:tcMar>
+              <w:top w:type="dxa" w:w="60"/>
+              <w:left w:type="dxa" w:w="100"/>
+              <w:bottom w:type="dxa" w:w="60"/>
+              <w:right w:type="dxa" w:w="100"/>
+            </w:tcMar>
+          </w:tcPr>
+          <w:p>
+            <w:r>
+              <w:rPr>
+                <w:b w:val="false"/>
+                <w:bCs w:val="false"/>
+                <w:sz w:val="19"/>
+                <w:szCs w:val="19"/>
+              </w:rPr>
+              <w:t xml:space="preserve">Cleaned dataset</w:t>
+            </w:r>
+          </w:p>
+        </w:tc>
+        <w:tc>
+          <w:tcPr>
+            <w:tcW w:type="dxa" w:w="5726"/>
+            <w:tcBorders>
+              <w:top w:val="single" w:color="BFC5CC" w:sz="4"/>
+              <w:left w:val="single" w:color="BFC5CC" w:sz="4"/>
+              <w:bottom w:val="single" w:color="BFC5CC" w:sz="4"/>
+              <w:right w:val="single" w:color="BFC5CC" w:sz="4"/>
+            </w:tcBorders>
+            <w:shd w:fill="F5F7FA" w:val="clear"/>
+            <w:tcMar>
+              <w:top w:type="dxa" w:w="60"/>
+              <w:left w:type="dxa" w:w="100"/>
+              <w:bottom w:type="dxa" w:w="60"/>
+              <w:right w:type="dxa" w:w="100"/>
+            </w:tcMar>
+          </w:tcPr>
+          <w:p>
+            <w:r>
+              <w:rPr>
+                <w:b w:val="false"/>
+                <w:bCs w:val="false"/>
+                <w:sz w:val="19"/>
+                <w:szCs w:val="19"/>
+              </w:rPr>
+              <w:t xml:space="preserve">data/processed/heart_clean.csv (raw file in data/raw/)</w:t>
+            </w:r>
+          </w:p>
+        </w:tc>
+      </w:tr>
+      <w:tr>
+        <w:trPr>
+          <w:tblHeader w:val="false"/>
+        </w:trPr>
+        <w:tc>
+          <w:tcPr>
+            <w:tcW w:type="dxa" w:w="3300"/>
+            <w:tcBorders>
+              <w:top w:val="single" w:color="BFC5CC" w:sz="4"/>
+              <w:left w:val="single" w:color="BFC5CC" w:sz="4"/>
+              <w:bottom w:val="single" w:color="BFC5CC" w:sz="4"/>
+              <w:right w:val="single" w:color="BFC5CC" w:sz="4"/>
+            </w:tcBorders>
+            <w:tcMar>
+              <w:top w:type="dxa" w:w="60"/>
+              <w:left w:type="dxa" w:w="100"/>
+              <w:bottom w:type="dxa" w:w="60"/>
+              <w:right w:type="dxa" w:w="100"/>
+            </w:tcMar>
+          </w:tcPr>
+          <w:p>
+            <w:r>
+              <w:rPr>
+                <w:b w:val="false"/>
+                <w:bCs w:val="false"/>
+                <w:sz w:val="19"/>
+                <w:szCs w:val="19"/>
+              </w:rPr>
+              <w:t xml:space="preserve">Download script / instructions</w:t>
+            </w:r>
+          </w:p>
+        </w:tc>
+        <w:tc>
+          <w:tcPr>
+            <w:tcW w:type="dxa" w:w="5726"/>
+            <w:tcBorders>
+              <w:top w:val="single" w:color="BFC5CC" w:sz="4"/>
+              <w:left w:val="single" w:color="BFC5CC" w:sz="4"/>
+              <w:bottom w:val="single" w:color="BFC5CC" w:sz="4"/>
+              <w:right w:val="single" w:color="BFC5CC" w:sz="4"/>
+            </w:tcBorders>
+            <w:tcMar>
+              <w:top w:type="dxa" w:w="60"/>
+              <w:left w:type="dxa" w:w="100"/>
+              <w:bottom w:type="dxa" w:w="60"/>
+              <w:right w:type="dxa" w:w="100"/>
+            </w:tcMar>
+          </w:tcPr>
+          <w:p>
+            <w:r>
+              <w:rPr>
+                <w:b w:val="false"/>
+                <w:bCs w:val="false"/>
+                <w:sz w:val="19"/>
+                <w:szCs w:val="19"/>
+              </w:rPr>
+              <w:t xml:space="preserve">scripts/download_data.py; README section 2</w:t>
+            </w:r>
+          </w:p>
+        </w:tc>
+      </w:tr>
+      <w:tr>
+        <w:trPr>
+          <w:tblHeader w:val="false"/>
+        </w:trPr>
+        <w:tc>
+          <w:tcPr>
+            <w:tcW w:type="dxa" w:w="3300"/>
+            <w:tcBorders>
+              <w:top w:val="single" w:color="BFC5CC" w:sz="4"/>
+              <w:left w:val="single" w:color="BFC5CC" w:sz="4"/>
+              <w:bottom w:val="single" w:color="BFC5CC" w:sz="4"/>
+              <w:right w:val="single" w:color="BFC5CC" w:sz="4"/>
+            </w:tcBorders>
+            <w:shd w:fill="F5F7FA" w:val="clear"/>
+            <w:tcMar>
+              <w:top w:type="dxa" w:w="60"/>
+              <w:left w:type="dxa" w:w="100"/>
+              <w:bottom w:type="dxa" w:w="60"/>
+              <w:right w:type="dxa" w:w="100"/>
+            </w:tcMar>
+          </w:tcPr>
+          <w:p>
+            <w:r>
+              <w:rPr>
+                <w:b w:val="false"/>
+                <w:bCs w:val="false"/>
+                <w:sz w:val="19"/>
+                <w:szCs w:val="19"/>
+              </w:rPr>
+              <w:t xml:space="preserve">Notebooks / scripts (EDA, training, inference)</w:t>
+            </w:r>
+          </w:p>
+        </w:tc>
+        <w:tc>
+          <w:tcPr>
+            <w:tcW w:type="dxa" w:w="5726"/>
+            <w:tcBorders>
+              <w:top w:val="single" w:color="BFC5CC" w:sz="4"/>
+              <w:left w:val="single" w:color="BFC5CC" w:sz="4"/>
+              <w:bottom w:val="single" w:color="BFC5CC" w:sz="4"/>
+              <w:right w:val="single" w:color="BFC5CC" w:sz="4"/>
+            </w:tcBorders>
+            <w:shd w:fill="F5F7FA" w:val="clear"/>
+            <w:tcMar>
+              <w:top w:type="dxa" w:w="60"/>
+              <w:left w:type="dxa" w:w="100"/>
+              <w:bottom w:type="dxa" w:w="60"/>
+              <w:right w:type="dxa" w:w="100"/>
+            </w:tcMar>
+          </w:tcPr>
+          <w:p>
+            <w:r>
+              <w:rPr>
+                <w:b w:val="false"/>
+                <w:bCs w:val="false"/>
+                <w:sz w:val="19"/>
+                <w:szCs w:val="19"/>
+              </w:rPr>
+              <w:t xml:space="preserve">notebooks/eda_training_inference.ipynb; scripts/eda.py; src/heart/train.py; src/heart/predict.py</w:t>
+            </w:r>
+          </w:p>
+        </w:tc>
+      </w:tr>
+      <w:tr>
+        <w:trPr>
+          <w:tblHeader w:val="false"/>
+        </w:trPr>
+        <w:tc>
+          <w:tcPr>
+            <w:tcW w:type="dxa" w:w="3300"/>
+            <w:tcBorders>
+              <w:top w:val="single" w:color="BFC5CC" w:sz="4"/>
+              <w:left w:val="single" w:color="BFC5CC" w:sz="4"/>
+              <w:bottom w:val="single" w:color="BFC5CC" w:sz="4"/>
+              <w:right w:val="single" w:color="BFC5CC" w:sz="4"/>
+            </w:tcBorders>
+            <w:tcMar>
+              <w:top w:type="dxa" w:w="60"/>
+              <w:left w:type="dxa" w:w="100"/>
+              <w:bottom w:type="dxa" w:w="60"/>
+              <w:right w:type="dxa" w:w="100"/>
+            </w:tcMar>
+          </w:tcPr>
+          <w:p>
+            <w:r>
+              <w:rPr>
+                <w:b w:val="false"/>
+                <w:bCs w:val="false"/>
+                <w:sz w:val="19"/>
+                <w:szCs w:val="19"/>
+              </w:rPr>
+              <w:t xml:space="preserve">tests/ folder with unit tests</w:t>
+            </w:r>
+          </w:p>
+        </w:tc>
+        <w:tc>
+          <w:tcPr>
+            <w:tcW w:type="dxa" w:w="5726"/>
+            <w:tcBorders>
+              <w:top w:val="single" w:color="BFC5CC" w:sz="4"/>
+              <w:left w:val="single" w:color="BFC5CC" w:sz="4"/>
+              <w:bottom w:val="single" w:color="BFC5CC" w:sz="4"/>
+              <w:right w:val="single" w:color="BFC5CC" w:sz="4"/>
+            </w:tcBorders>
+            <w:tcMar>
+              <w:top w:type="dxa" w:w="60"/>
+              <w:left w:type="dxa" w:w="100"/>
+              <w:bottom w:type="dxa" w:w="60"/>
+              <w:right w:type="dxa" w:w="100"/>
+            </w:tcMar>
+          </w:tcPr>
+          <w:p>
+            <w:r>
+              <w:rPr>
+                <w:b w:val="false"/>
+                <w:bCs w:val="false"/>
+                <w:sz w:val="19"/>
+                <w:szCs w:val="19"/>
+              </w:rPr>
+              <w:t xml:space="preserve">tests/ – 24 pytest tests (data, features, models, API)</w:t>
+            </w:r>
+          </w:p>
+        </w:tc>
+      </w:tr>
+      <w:tr>
+        <w:trPr>
+          <w:tblHeader w:val="false"/>
+        </w:trPr>
+        <w:tc>
+          <w:tcPr>
+            <w:tcW w:type="dxa" w:w="3300"/>
+            <w:tcBorders>
+              <w:top w:val="single" w:color="BFC5CC" w:sz="4"/>
+              <w:left w:val="single" w:color="BFC5CC" w:sz="4"/>
+              <w:bottom w:val="single" w:color="BFC5CC" w:sz="4"/>
+              <w:right w:val="single" w:color="BFC5CC" w:sz="4"/>
+            </w:tcBorders>
+            <w:shd w:fill="F5F7FA" w:val="clear"/>
+            <w:tcMar>
+              <w:top w:type="dxa" w:w="60"/>
+              <w:left w:type="dxa" w:w="100"/>
+              <w:bottom w:type="dxa" w:w="60"/>
+              <w:right w:type="dxa" w:w="100"/>
+            </w:tcMar>
+          </w:tcPr>
+          <w:p>
+            <w:r>
+              <w:rPr>
+                <w:b w:val="false"/>
+                <w:bCs w:val="false"/>
+                <w:sz w:val="19"/>
+                <w:szCs w:val="19"/>
+              </w:rPr>
+              <w:t xml:space="preserve">GitHub Actions workflow YAML</w:t>
+            </w:r>
+          </w:p>
+        </w:tc>
+        <w:tc>
+          <w:tcPr>
+            <w:tcW w:type="dxa" w:w="5726"/>
+            <w:tcBorders>
+              <w:top w:val="single" w:color="BFC5CC" w:sz="4"/>
+              <w:left w:val="single" w:color="BFC5CC" w:sz="4"/>
+              <w:bottom w:val="single" w:color="BFC5CC" w:sz="4"/>
+              <w:right w:val="single" w:color="BFC5CC" w:sz="4"/>
+            </w:tcBorders>
+            <w:shd w:fill="F5F7FA" w:val="clear"/>
+            <w:tcMar>
+              <w:top w:type="dxa" w:w="60"/>
+              <w:left w:type="dxa" w:w="100"/>
+              <w:bottom w:type="dxa" w:w="60"/>
+              <w:right w:type="dxa" w:w="100"/>
+            </w:tcMar>
+          </w:tcPr>
+          <w:p>
+            <w:r>
+              <w:rPr>
+                <w:b w:val="false"/>
+                <w:bCs w:val="false"/>
+                <w:sz w:val="19"/>
+                <w:szCs w:val="19"/>
+              </w:rPr>
+              <w:t xml:space="preserve">.github/workflows/ci.yml</w:t>
+            </w:r>
+          </w:p>
+        </w:tc>
+      </w:tr>
+      <w:tr>
+        <w:trPr>
+          <w:tblHeader w:val="false"/>
+        </w:trPr>
+        <w:tc>
+          <w:tcPr>
+            <w:tcW w:type="dxa" w:w="3300"/>
+            <w:tcBorders>
+              <w:top w:val="single" w:color="BFC5CC" w:sz="4"/>
+              <w:left w:val="single" w:color="BFC5CC" w:sz="4"/>
+              <w:bottom w:val="single" w:color="BFC5CC" w:sz="4"/>
+              <w:right w:val="single" w:color="BFC5CC" w:sz="4"/>
+            </w:tcBorders>
+            <w:tcMar>
+              <w:top w:type="dxa" w:w="60"/>
+              <w:left w:type="dxa" w:w="100"/>
+              <w:bottom w:type="dxa" w:w="60"/>
+              <w:right w:type="dxa" w:w="100"/>
+            </w:tcMar>
+          </w:tcPr>
+          <w:p>
+            <w:r>
+              <w:rPr>
+                <w:b w:val="false"/>
+                <w:bCs w:val="false"/>
+                <w:sz w:val="19"/>
+                <w:szCs w:val="19"/>
+              </w:rPr>
+              <w:t xml:space="preserve">Deployment manifests</w:t>
+            </w:r>
+          </w:p>
+        </w:tc>
+        <w:tc>
+          <w:tcPr>
+            <w:tcW w:type="dxa" w:w="5726"/>
+            <w:tcBorders>
+              <w:top w:val="single" w:color="BFC5CC" w:sz="4"/>
+              <w:left w:val="single" w:color="BFC5CC" w:sz="4"/>
+              <w:bottom w:val="single" w:color="BFC5CC" w:sz="4"/>
+              <w:right w:val="single" w:color="BFC5CC" w:sz="4"/>
+            </w:tcBorders>
+            <w:tcMar>
+              <w:top w:type="dxa" w:w="60"/>
+              <w:left w:type="dxa" w:w="100"/>
+              <w:bottom w:type="dxa" w:w="60"/>
+              <w:right w:type="dxa" w:w="100"/>
+            </w:tcMar>
+          </w:tcPr>
+          <w:p>
+            <w:r>
+              <w:rPr>
+                <w:b w:val="false"/>
+                <w:bCs w:val="false"/>
+                <w:sz w:val="19"/>
+                <w:szCs w:val="19"/>
+              </w:rPr>
+              <w:t xml:space="preserve">k8s/ – namespace, deployment, service, ingress, monitoring</w:t>
+            </w:r>
+          </w:p>
+        </w:tc>
+      </w:tr>
+      <w:tr>
+        <w:trPr>
+          <w:tblHeader w:val="false"/>
+        </w:trPr>
+        <w:tc>
+          <w:tcPr>
+            <w:tcW w:type="dxa" w:w="3300"/>
+            <w:tcBorders>
+              <w:top w:val="single" w:color="BFC5CC" w:sz="4"/>
+              <w:left w:val="single" w:color="BFC5CC" w:sz="4"/>
+              <w:bottom w:val="single" w:color="BFC5CC" w:sz="4"/>
+              <w:right w:val="single" w:color="BFC5CC" w:sz="4"/>
+            </w:tcBorders>
+            <w:shd w:fill="F5F7FA" w:val="clear"/>
+            <w:tcMar>
+              <w:top w:type="dxa" w:w="60"/>
+              <w:left w:type="dxa" w:w="100"/>
+              <w:bottom w:type="dxa" w:w="60"/>
+              <w:right w:type="dxa" w:w="100"/>
+            </w:tcMar>
+          </w:tcPr>
+          <w:p>
+            <w:r>
+              <w:rPr>
+                <w:b w:val="false"/>
+                <w:bCs w:val="false"/>
+                <w:sz w:val="19"/>
+                <w:szCs w:val="19"/>
+              </w:rPr>
+              <w:t xml:space="preserve">Screenshot folder</w:t>
+            </w:r>
+          </w:p>
+        </w:tc>
+        <w:tc>
+          <w:tcPr>
+            <w:tcW w:type="dxa" w:w="5726"/>
+            <w:tcBorders>
+              <w:top w:val="single" w:color="BFC5CC" w:sz="4"/>
+              <w:left w:val="single" w:color="BFC5CC" w:sz="4"/>
+              <w:bottom w:val="single" w:color="BFC5CC" w:sz="4"/>
+              <w:right w:val="single" w:color="BFC5CC" w:sz="4"/>
+            </w:tcBorders>
+            <w:shd w:fill="F5F7FA" w:val="clear"/>
+            <w:tcMar>
+              <w:top w:type="dxa" w:w="60"/>
+              <w:left w:type="dxa" w:w="100"/>
+              <w:bottom w:type="dxa" w:w="60"/>
+              <w:right w:type="dxa" w:w="100"/>
+            </w:tcMar>
+          </w:tcPr>
+          <w:p>
+            <w:r>
+              <w:rPr>
+                <w:b w:val="false"/>
+                <w:bCs w:val="false"/>
+                <w:sz w:val="19"/>
+                <w:szCs w:val="19"/>
+              </w:rPr>
+              <w:t xml:space="preserve">screenshots/ – MLflow, CI, Grafana, Swagger, Kubernetes, video frames, failure demo</w:t>
+            </w:r>
+          </w:p>
+        </w:tc>
+      </w:tr>
+      <w:tr>
+        <w:trPr>
+          <w:tblHeader w:val="false"/>
+        </w:trPr>
+        <w:tc>
+          <w:tcPr>
+            <w:tcW w:type="dxa" w:w="3300"/>
+            <w:tcBorders>
+              <w:top w:val="single" w:color="BFC5CC" w:sz="4"/>
+              <w:left w:val="single" w:color="BFC5CC" w:sz="4"/>
+              <w:bottom w:val="single" w:color="BFC5CC" w:sz="4"/>
+              <w:right w:val="single" w:color="BFC5CC" w:sz="4"/>
+            </w:tcBorders>
+            <w:tcMar>
+              <w:top w:type="dxa" w:w="60"/>
+              <w:left w:type="dxa" w:w="100"/>
+              <w:bottom w:type="dxa" w:w="60"/>
+              <w:right w:type="dxa" w:w="100"/>
+            </w:tcMar>
+          </w:tcPr>
+          <w:p>
+            <w:r>
+              <w:rPr>
+                <w:b w:val="false"/>
+                <w:bCs w:val="false"/>
+                <w:sz w:val="19"/>
+                <w:szCs w:val="19"/>
+              </w:rPr>
+              <w:t xml:space="preserve">Final written report</w:t>
+            </w:r>
+          </w:p>
+        </w:tc>
+        <w:tc>
+          <w:tcPr>
+            <w:tcW w:type="dxa" w:w="5726"/>
+            <w:tcBorders>
+              <w:top w:val="single" w:color="BFC5CC" w:sz="4"/>
+              <w:left w:val="single" w:color="BFC5CC" w:sz="4"/>
+              <w:bottom w:val="single" w:color="BFC5CC" w:sz="4"/>
+              <w:right w:val="single" w:color="BFC5CC" w:sz="4"/>
+            </w:tcBorders>
+            <w:tcMar>
+              <w:top w:type="dxa" w:w="60"/>
+              <w:left w:type="dxa" w:w="100"/>
+              <w:bottom w:type="dxa" w:w="60"/>
+              <w:right w:type="dxa" w:w="100"/>
+            </w:tcMar>
+          </w:tcPr>
+          <w:p>
+            <w:r>
+              <w:rPr>
+                <w:b w:val="false"/>
+                <w:bCs w:val="false"/>
+                <w:sz w:val="19"/>
+                <w:szCs w:val="19"/>
+              </w:rPr>
+              <w:t xml:space="preserve">reports/MLOps_Assignment1_Report.docx (this document)</w:t>
+            </w:r>
+          </w:p>
+        </w:tc>
+      </w:tr>
+      <w:tr>
+        <w:trPr>
+          <w:tblHeader w:val="false"/>
+        </w:trPr>
+        <w:tc>
+          <w:tcPr>
+            <w:tcW w:type="dxa" w:w="3300"/>
+            <w:tcBorders>
+              <w:top w:val="single" w:color="BFC5CC" w:sz="4"/>
+              <w:left w:val="single" w:color="BFC5CC" w:sz="4"/>
+              <w:bottom w:val="single" w:color="BFC5CC" w:sz="4"/>
+              <w:right w:val="single" w:color="BFC5CC" w:sz="4"/>
+            </w:tcBorders>
+            <w:shd w:fill="F5F7FA" w:val="clear"/>
+            <w:tcMar>
+              <w:top w:type="dxa" w:w="60"/>
+              <w:left w:type="dxa" w:w="100"/>
+              <w:bottom w:type="dxa" w:w="60"/>
+              <w:right w:type="dxa" w:w="100"/>
+            </w:tcMar>
+          </w:tcPr>
+          <w:p>
+            <w:r>
+              <w:rPr>
+                <w:b w:val="false"/>
+                <w:bCs w:val="false"/>
+                <w:sz w:val="19"/>
+                <w:szCs w:val="19"/>
+              </w:rPr>
+              <w:t xml:space="preserve">API access instructions (local)</w:t>
+            </w:r>
+          </w:p>
+        </w:tc>
+        <w:tc>
+          <w:tcPr>
+            <w:tcW w:type="dxa" w:w="5726"/>
+            <w:tcBorders>
+              <w:top w:val="single" w:color="BFC5CC" w:sz="4"/>
+              <w:left w:val="single" w:color="BFC5CC" w:sz="4"/>
+              <w:bottom w:val="single" w:color="BFC5CC" w:sz="4"/>
+              <w:right w:val="single" w:color="BFC5CC" w:sz="4"/>
+            </w:tcBorders>
+            <w:shd w:fill="F5F7FA" w:val="clear"/>
+            <w:tcMar>
+              <w:top w:type="dxa" w:w="60"/>
+              <w:left w:type="dxa" w:w="100"/>
+              <w:bottom w:type="dxa" w:w="60"/>
+              <w:right w:type="dxa" w:w="100"/>
+            </w:tcMar>
+          </w:tcPr>
+          <w:p>
+            <w:r>
+              <w:rPr>
+                <w:b w:val="false"/>
+                <w:bCs w:val="false"/>
+                <w:sz w:val="19"/>
+                <w:szCs w:val="19"/>
+              </w:rPr>
+              <w:t xml:space="preserve">README sections 5–7: Docker http://localhost:8000/docs; Kubernetes http://localhost:8080</w:t>
+            </w:r>
+          </w:p>
+        </w:tc>
+      </w:tr>
+      <w:tr>
+        <w:trPr>
+          <w:tblHeader w:val="false"/>
+        </w:trPr>
+        <w:tc>
+          <w:tcPr>
+            <w:tcW w:type="dxa" w:w="3300"/>
+            <w:tcBorders>
+              <w:top w:val="single" w:color="BFC5CC" w:sz="4"/>
+              <w:left w:val="single" w:color="BFC5CC" w:sz="4"/>
+              <w:bottom w:val="single" w:color="BFC5CC" w:sz="4"/>
+              <w:right w:val="single" w:color="BFC5CC" w:sz="4"/>
+            </w:tcBorders>
+            <w:tcMar>
+              <w:top w:type="dxa" w:w="60"/>
+              <w:left w:type="dxa" w:w="100"/>
+              <w:bottom w:type="dxa" w:w="60"/>
+              <w:right w:type="dxa" w:w="100"/>
+            </w:tcMar>
+          </w:tcPr>
+          <w:p>
+            <w:r>
+              <w:rPr>
+                <w:b w:val="false"/>
+                <w:bCs w:val="false"/>
+                <w:sz w:val="19"/>
+                <w:szCs w:val="19"/>
+              </w:rPr>
+              <w:t xml:space="preserve">Video of the overall pipeline</w:t>
+            </w:r>
+          </w:p>
+        </w:tc>
+        <w:tc>
+          <w:tcPr>
+            <w:tcW w:type="dxa" w:w="5726"/>
+            <w:tcBorders>
+              <w:top w:val="single" w:color="BFC5CC" w:sz="4"/>
+              <w:left w:val="single" w:color="BFC5CC" w:sz="4"/>
+              <w:bottom w:val="single" w:color="BFC5CC" w:sz="4"/>
+              <w:right w:val="single" w:color="BFC5CC" w:sz="4"/>
+            </w:tcBorders>
+            <w:tcMar>
+              <w:top w:type="dxa" w:w="60"/>
+              <w:left w:type="dxa" w:w="100"/>
+              <w:bottom w:type="dxa" w:w="60"/>
+              <w:right w:type="dxa" w:w="100"/>
+            </w:tcMar>
+          </w:tcPr>
+          <w:p>
+            <w:r>
+              <w:rPr>
+                <w:b w:val="false"/>
+                <w:bCs w:val="false"/>
+                <w:sz w:val="19"/>
+                <w:szCs w:val="19"/>
+              </w:rPr>
+              <w:t xml:space="preserve">Google Drive (link below)</w:t>
+            </w:r>
+          </w:p>
+        </w:tc>
+      </w:tr>
+    </w:tbl>
+    <w:p>
+      <w:pPr>
+        <w:spacing w:after="160"/>
+      </w:pPr>
     </w:p>
     <w:p>
       <w:pPr>
@@ -5444,82 +6501,9 @@
         <w:spacing w:after="60"/>
       </w:pPr>
       <w:r>
-        <w:t xml:space="preserve">Data versioning with DVC.</w:t>
-      </w:r>
-    </w:p>
-    <w:p>
-      <w:pPr>
-        <w:pStyle w:val="ListParagraph"/>
-        <w:numPr>
-          <w:ilvl w:val="0"/>
-          <w:numId w:val="2"/>
-        </w:numPr>
-        <w:spacing w:after="60"/>
-      </w:pPr>
-      <w:r>
-        <w:t xml:space="preserve">Probability calibration, and tuning the decision threshold to a target recall.</w:t>
-      </w:r>
-    </w:p>
-    <w:p>
-      <w:pPr>
-        <w:pStyle w:val="ListParagraph"/>
-        <w:numPr>
-          <w:ilvl w:val="0"/>
-          <w:numId w:val="2"/>
-        </w:numPr>
-        <w:spacing w:after="60"/>
-      </w:pPr>
-      <w:r>
-        <w:t xml:space="preserve">Drift alerts on the risk histogram.</w:t>
-      </w:r>
-    </w:p>
-    <w:p>
-      <w:pPr>
-        <w:pStyle w:val="ListParagraph"/>
-        <w:numPr>
-          <w:ilvl w:val="0"/>
-          <w:numId w:val="2"/>
-        </w:numPr>
-        <w:spacing w:after="60"/>
-      </w:pPr>
-      <w:r>
-        <w:t xml:space="preserve">Canary releases driven by the MLflow registry stages.</w:t>
-      </w:r>
-    </w:p>
-    <w:p>
-      <w:pPr>
-        <w:pStyle w:val="ListParagraph"/>
-        <w:numPr>
-          <w:ilvl w:val="0"/>
-          <w:numId w:val="2"/>
-        </w:numPr>
-        <w:spacing w:after="60"/>
-      </w:pPr>
-      <w:r>
-        <w:t xml:space="preserve">Validation on the other UCI sites (Hungary, Switzerland, VA) to test generalisation.</w:t>
-      </w:r>
-    </w:p>
-    <w:p>
-      <w:pPr>
-        <w:pStyle w:val="Heading2"/>
-      </w:pPr>
-      <w:r>
-        <w:t xml:space="preserve">Deliverables</w:t>
-      </w:r>
-    </w:p>
-    <w:p>
-      <w:pPr>
-        <w:pStyle w:val="ListParagraph"/>
-        <w:numPr>
-          <w:ilvl w:val="0"/>
-          <w:numId w:val="2"/>
-        </w:numPr>
-        <w:spacing w:after="60"/>
-      </w:pPr>
-      <w:r>
         <w:t xml:space="preserve">Code repository: </w:t>
       </w:r>
-      <w:hyperlink w:history="1" r:id="rIdkbalvckxyvdlu89wu-3gi">
+      <w:hyperlink w:history="1" r:id="rIdfprsv2tyn3iw7awy3japu">
         <w:r>
           <w:rPr>
             <w:rStyle w:val="Hyperlink"/>
@@ -5538,8 +6522,16 @@
         <w:spacing w:after="60"/>
       </w:pPr>
       <w:r>
-        <w:t xml:space="preserve">Local access: http://localhost:8000/docs (Docker) and http://localhost:8080 (Kubernetes); see README sections 5–7.</w:t>
-      </w:r>
+        <w:t xml:space="preserve">Pipeline video: </w:t>
+      </w:r>
+      <w:hyperlink w:history="1" r:id="rIdnsrm4zxyzuwzsqvdvio_r">
+        <w:r>
+          <w:rPr>
+            <w:rStyle w:val="Hyperlink"/>
+          </w:rPr>
+          <w:t xml:space="preserve">https://drive.google.com/file/d/1gQOQwV9dFOO2UPr-XfQWQJF8PV675Mvh/view?usp=sharing</w:t>
+        </w:r>
+      </w:hyperlink>
     </w:p>
     <w:p>
       <w:pPr>
@@ -5551,7 +6543,23 @@
         <w:spacing w:after="60"/>
       </w:pPr>
       <w:r>
-        <w:t xml:space="preserve">Screenshots: the screenshots/ folder. Pipeline video: submitted separately.</w:t>
+        <w:t xml:space="preserve">Local access: docker compose up -d → API http://localhost:8000/docs, Prometheus http://localhost:9090, Grafana http://localhost:3001 (admin/admin); kubectl apply -f k8s/ → http://localhost:8080; MLflow: mlflow ui --backend-store-uri sqlite:///mlflow.db → http://localhost:5000.</w:t>
+      </w:r>
+    </w:p>
+    <w:p>
+      <w:pPr>
+        <w:pStyle w:val="Heading1"/>
+      </w:pPr>
+      <w:r>
+        <w:t xml:space="preserve">13. Conclusion and Future Work</w:t>
+      </w:r>
+    </w:p>
+    <w:p>
+      <w:pPr>
+        <w:spacing w:after="120" w:line="276"/>
+      </w:pPr>
+      <w:r>
+        <w:t xml:space="preserve">The project delivers a reproducible pipeline from raw UCI data to a monitored, containerised API on Kubernetes, rebuilt and verified automatically on every commit. The selected Logistic Regression model reaches a cross-validated ROC-AUC of about 0.91 and a held-out recall of 0.93. Possible extensions: data versioning with DVC; probability calibration and a recall-targeted decision threshold; drift alerts on the risk histogram; canary releases driven by MLflow registry stages; and validation on the other UCI sites (Hungary, Switzerland, VA).</w:t>
       </w:r>
     </w:p>
     <w:p>
@@ -5573,7 +6581,7 @@
     <w:sectPr>
       <w:footerReference w:type="default" r:id="rId7"/>
       <w:pgSz w:w="11906" w:h="16838" w:orient="portrait"/>
-      <w:pgMar w:top="1440" w:right="1440" w:bottom="1440" w:left="1440" w:header="708" w:footer="708" w:gutter="0"/>
+      <w:pgMar w:top="1300" w:right="1300" w:bottom="1300" w:left="1300" w:header="708" w:footer="708" w:gutter="0"/>
       <w:pgNumType/>
       <w:docGrid w:linePitch="360"/>
     </w:sectPr>
@@ -5634,7 +6642,7 @@
         <w:sz w:val="18"/>
         <w:szCs w:val="18"/>
       </w:rPr>
-      <w:t xml:space="preserve">MLOps Assignment 1 — page </w:t>
+      <w:t xml:space="preserve">R Harsh Sai Kumar (2025AE05662) — MLOps Assignment 1 — page </w:t>
     </w:r>
     <w:r>
       <w:rPr>
@@ -5783,15 +6791,6 @@
       <w:lvlJc w:val="left"/>
       <w:pPr>
         <w:ind w:left="720" w:hanging="360"/>
-      </w:pPr>
-    </w:lvl>
-    <w:lvl w:ilvl="1" w15:tentative="1">
-      <w:start w:val="1"/>
-      <w:numFmt w:val="bullet"/>
-      <w:lvlText w:val="◦"/>
-      <w:lvlJc w:val="left"/>
-      <w:pPr>
-        <w:ind w:left="1440" w:hanging="360"/>
       </w:pPr>
     </w:lvl>
   </w:abstractNum>
@@ -5999,7 +6998,7 @@
     <w:next w:val="Normal"/>
     <w:qFormat/>
     <w:pPr>
-      <w:spacing w:after="160" w:before="360"/>
+      <w:spacing w:after="140" w:before="320"/>
       <w:outlineLvl w:val="0"/>
     </w:pPr>
     <w:rPr>
@@ -6017,7 +7016,7 @@
     <w:next w:val="Normal"/>
     <w:qFormat/>
     <w:pPr>
-      <w:spacing w:after="120" w:before="240"/>
+      <w:spacing w:after="100" w:before="220"/>
       <w:outlineLvl w:val="1"/>
     </w:pPr>
     <w:rPr>

</xml_diff>